<commit_message>
build(submission): rebuild the journal packages, talks and data snapshot
- GCB, NEE and NC packages, cover letters, Reporting Summary, the Chinese
  abstract and the v3/v4 talks rebuilt with the corrected numbers
- 205 no longer drops the GBIF.org reference (data citations are kept); 212
  now resolves dotted corporate authors, so an in-text citation without an
  entry fails QC
- 231 re-renders .docx files that no step regenerated from their .md (Reporting
  Summary, Chinese abstract, Nature-family main text, tables and legends) and
  checks that every number in each .md appears in its .docx
- the Reporting Summary gives the 2024 GBIF DOI; data_and_code/ includes 191b
  and 222-231, and 220 syncs effort2024_audit/
</commit_message>
<xml_diff>
--- a/submission/GCB/Manuscript_GCB_main_document.docx
+++ b/submission/GCB/Manuscript_GCB_main_document.docx
@@ -85,7 +85,7 @@
         <w:pStyle w:val="FirstParagraph"/>
       </w:pPr>
       <w:r>
-        <w:t xml:space="preserve">New distribution records are widely read as evidence that species’ ranges are shifting, yet a record exists only when a species is present, someone detects it and the detection is published. In mainland China, birding visits in the main checklist databases rose about 175-fold between 2002–2004 and 2022–2024, so the ecological and observational signals in these records are hard to separate. We analysed 1,029 provincial new bird records from the China Bird New Record dataset with a discrete-time hazard model of first records across 175,901 species × province × year cells (2002–2024), dating each record to its discovery and modelling the observation process explicitly. Publication lagged discovery by 2.09 years on average. Dating records to publication, the usual practice, inflated the survey-effort hazard ratio by 37% (1.79 versus 1.31) and created a spurious effect of annual climate variability, while accumulated warming was unaffected. After correction, warming of a province relative to each species’ historical range (hazard ratio 1.36 per SD, 95% CI 1.22–1.52) and survey effort (1.40, 1.25–1.58) contributed comparably and interacted negatively (0.85, 0.76–0.95). Permutation nulls that preserve the data structure centred the warming estimate on 1.157, so the species-specific component is about 1.18; the effort estimate fell to 0.980 when its timing was scrambled. A province-by-year random intercept, the largest variance component, raised conditional discrimination from 0.72 to 0.85. The return on effort fell from 2.18 in 2002 to 1.07 in 2024, whereas the return on warming showed no detectable change. The apparent eastward bias of new records relative to species’ range centroids was reproduced by geography alone; against an effort-weighted null, records lay slightly further north than expected. New records thus reflect climate and observation in similar measure, and the date attached to a record decides which appears to dominate.</w:t>
+        <w:t xml:space="preserve">New distribution records are widely read as evidence that species’ ranges are shifting, yet a record exists only when a species is present, someone detects it and the detection is published. In mainland China, birding visits in the main checklist databases rose about 200-fold between 2002–2004 and 2022–2024, so the ecological and observational signals in these records are hard to separate. We analysed 1,029 provincial new bird records from the China Bird New Record dataset with a discrete-time hazard model of first records across 175,640 species × province × year cells (2002–2024), dating each record to its discovery and modelling the observation process explicitly. Publication lagged discovery by 2.09 years on average. Dating records to publication, the usual practice, inflated the survey-effort hazard ratio by 37% (1.79 versus 1.31) and created a spurious effect of annual climate variability, while accumulated warming was unaffected. After correction, warming of a province relative to each species’ historical range (hazard ratio 1.36 per SD, 95% CI 1.22–1.53) and survey effort (1.43, 1.27–1.61) contributed comparably and interacted negatively (0.84, 0.75–0.94). Permutation nulls that preserve the data structure centred the warming estimate on 1.161, so the species-specific component is about 1.18; the effort estimate fell to 0.979 when its timing was scrambled. A province-by-year random intercept, the largest variance component, raised conditional discrimination from 0.72 to 0.85. The return on effort fell from 2.14 in 2002 to 1.13 in 2024, whereas the return on warming showed no detectable change. The apparent eastward bias of new records relative to species’ range centroids was reproduced by geography alone; against an effort-weighted null, records lay slightly further north than expected. New records thus reflect climate and observation in similar measure, and the date attached to a record decides which appears to dominate.</w:t>
       </w:r>
     </w:p>
     <w:p>
@@ -129,7 +129,7 @@
         <w:pStyle w:val="BodyText"/>
       </w:pPr>
       <w:r>
-        <w:t xml:space="preserve">The difficulty is that observation has grown as quickly as the climate has changed. Documented distributions reflect where people look as well as where organisms live (Boakes et al., 2010; Hortal et al., 2015; Oliver et al., 2021), and many records reported as new fill gaps in knowledge, the Wallacean shortfall, without any change in range (Moura &amp; Jetz, 2021; Diniz-Filho et al., 2023). In mainland China, the annual number of birding visits logged in the eBird and China Bird Report databases rose about 175-fold between 2002–2004 and 2022–2024 (Materials and Methods), the period over which the shifts above were reported. Any series of new records from these years will correlate with the growth of observation, whatever the contribution of climate. Opportunistic records yield unbiased trends only when the recording process is modelled (Isaac et al., 2014), and gaps and biases in such data are best treated as a missing-data problem (Bowler et al., 2025), yet compilations of first records have not been analysed in this way.</w:t>
+        <w:t xml:space="preserve">The difficulty is that observation has grown as quickly as the climate has changed. Documented distributions reflect where people look as well as where organisms live (Boakes et al., 2010; Hortal et al., 2015; Oliver et al., 2021), and many records reported as new fill gaps in knowledge, the Wallacean shortfall, without any change in range (Moura &amp; Jetz, 2021; Diniz-Filho et al., 2023). In mainland China, the annual number of birding visits logged in the eBird and China Bird Report databases rose about 200-fold between 2002–2004 and 2022–2024 (Materials and Methods), the period over which the shifts above were reported. Any series of new records from these years will correlate with the growth of observation, whatever the contribution of climate. Opportunistic records yield unbiased trends only when the recording process is modelled (Isaac et al., 2014), and gaps and biases in such data are best treated as a missing-data problem (Bowler et al., 2025), yet compilations of first records have not been analysed in this way.</w:t>
       </w:r>
     </w:p>
     <w:p>
@@ -1007,7 +1007,7 @@
         <w:pStyle w:val="FirstParagraph"/>
       </w:pPr>
       <w:r>
-        <w:t xml:space="preserve">Provincial annual survey effort was compiled from deduplicated eBird/GBIF occurrence records and China Bird Report checklists (http://www.birdreport.cn) through four proxies: visits, distinct observers, birding days and records. Thirty-nine province-years, all in Hong Kong, Macao and Taiwan, have no coverage in the source database. A further 24 mainland province-years were recorded as exactly zero. We treat these as coverage gaps rather than true zeros: in 22 of 24, the adjacent years in the same province record between one and 27 visits. In the main analysis these cells are missing; sensitivity analyses zero-fill them (the previously published treatment) and impute them by within-province linear interpolation on the log scale, which is bounded by the neighbouring observed values. Each proxy is log1p-transformed and standardised within the analysis scope separately for each missing-data rule. Summed over mainland provinces, annual visits rose from a mean of 493 in 2002–2004 to 86,380 in 2022–2024.</w:t>
+        <w:t xml:space="preserve">Provincial annual survey effort was compiled from deduplicated eBird/GBIF occurrence records and China Bird Report checklists (http://www.birdreport.cn) through four proxies: visits, distinct observers, birding days and records. eBird checklists for 2024, absent from the original download, were added with the same visit definition (GBIF.org, 2026); Guangdong 2024, with China Bird Report records for only 14 days, was treated as missing. Thirty-nine province-years (Hong Kong, Macao and Taiwan) have no coverage. A further 24 mainland province-years were recorded as exactly zero. We treat these as coverage gaps rather than true zeros: in 22 of 24, the adjacent years in the same province record between one and 27 visits. In the main analysis these cells are missing; sensitivity analyses zero-fill them (the previously published treatment) and impute them by within-province linear interpolation on the log scale, which is bounded by the neighbouring observed values. Each proxy is log1p-transformed and standardised within the analysis scope separately for each missing-data rule. Summed over mainland provinces, annual visits rose from a mean of 493 in 2002–2004 to 99,156 in 2022–2024.</w:t>
       </w:r>
     </w:p>
     <w:bookmarkEnd w:id="15"/>
@@ -1370,15 +1370,15 @@
         <w:pStyle w:val="FirstParagraph"/>
       </w:pPr>
       <w:r>
-        <w:t xml:space="preserve">CMIP6 four-model ensemble median deltas for annual mean temperature were computed for SSP2-4.5 and SSP5-8.5 at 2030, 2050 and 2080, separately for each province and each species range, and added to both ends of the climate gradient. Effort was grown at 0.30 (SSP2-4.5) and 0.60 (SSP5-8.5) standard deviations per decade. Predictions set the province-by-year random effect to its expectation and the completeness offset to log 1, so the projected quantity is the latent generation hazard. Support was defined as the 1st–99th percentile of the fitted accumulated warming and effort; main projection figures aggregate only cells inside this range, and the share of qualifying cells is reported on every panel.</w:t>
-      </w:r>
-    </w:p>
-    <w:p>
-      <w:pPr>
-        <w:pStyle w:val="BodyText"/>
-      </w:pPr>
-      <w:r>
-        <w:t xml:space="preserve">To separate the two scenario axes we also projected the frozen model over a 2 × 2 × 2 grid: SSP2-4.5 or SSP5-8.5 deltas; effort frozen at 2024 or growing at 0.6 SD per decade (observed pace 1.19); horizons 2030 and 2050. Province-by-year effects for future years were set to their expectation, species and province effects retained, and provincial expectations summed over species. Future county surfaces hold the 2024 allocation shares fixed.</w:t>
+        <w:t xml:space="preserve">CMIP6 four-model ensemble median deltas for annual mean temperature were computed for SSP2-4.5 and SSP5-8.5 at 2030, 2050 and 2080, separately for each province and each species range, and added to both ends of the climate gradient. Effort was grown at 0.30 (SSP2-4.5) and 0.60 (SSP5-8.5) standard deviations per decade. Predictions set the province-by-year random effect to its expectation and the completeness offset to log 1, so the projected quantity is the latent generation hazard. For projection, Guangdong’s 2024 effort was carried forward from 2023. Support was defined as the 1st–99th percentile of the fitted accumulated warming and effort; main projection figures aggregate only cells inside this range, and the share of qualifying cells is reported on every panel.</w:t>
+      </w:r>
+    </w:p>
+    <w:p>
+      <w:pPr>
+        <w:pStyle w:val="BodyText"/>
+      </w:pPr>
+      <w:r>
+        <w:t xml:space="preserve">To separate the two scenario axes we also projected the frozen model over a 2 × 2 × 2 grid: SSP2-4.5 or SSP5-8.5 deltas; effort frozen at 2024 or growing at 0.6 SD per decade (observed pace 1.22); horizons 2030 and 2050. Province-by-year effects for future years were set to their expectation, species and province effects retained, and provincial expectations summed over species. Future county surfaces hold the 2024 allocation shares fixed.</w:t>
       </w:r>
     </w:p>
     <w:bookmarkEnd w:id="19"/>
@@ -1500,7 +1500,7 @@
         <w:pStyle w:val="BodyText"/>
       </w:pPr>
       <w:r>
-        <w:t xml:space="preserve">After requiring non-missing effort and climate components, the risk set at the 50-cell threshold (8,319 species × province pairs, 185,478 rows and 657 events) yields modelling data of 175,901 rows, 649 events, 392 species and 31 provincial units.</w:t>
+        <w:t xml:space="preserve">After requiring non-missing effort and climate components, the risk set at the 50-cell threshold (8,319 species × province pairs, 185,478 rows and 657 events) yields modelling data of 175,640 rows, 649 events, 392 species and 31 provincial units.</w:t>
       </w:r>
     </w:p>
     <w:bookmarkEnd w:id="24"/>
@@ -1526,7 +1526,7 @@
         <w:pStyle w:val="BodyText"/>
       </w:pPr>
       <w:r>
-        <w:t xml:space="preserve">Re-dating alone moves the survey-effort hazard ratio from 1.788 to 1.305, so that the publication-year estimate is 37% larger than the corrected one, and moves the annual-variability hazard ratio from 0.850 (</w:t>
+        <w:t xml:space="preserve">Re-dating alone moves the survey-effort hazard ratio from 1.788 to 1.309, so that the publication-year estimate is 37% larger than the corrected one, and moves the annual-variability hazard ratio from 0.850 (</w:t>
       </w:r>
       <w:r>
         <w:rPr>
@@ -1552,7 +1552,7 @@
         <w:t xml:space="preserve"> </w:t>
       </w:r>
       <w:r>
-        <w:t xml:space="preserve">= 0.48). The accumulated-warming coefficient barely changes (1.394 → 1.437), and neither does the interaction (0.876 → 0.859), as H1 predicted. The remaining corrections are comparatively minor: treating structural zeros in the effort database as coverage gaps moves effort by −0.038; area-weighting the provincial climate series moves it by +0.022; the completeness offset restores +0.159, recovering signal that right-censoring had attenuated; and the province-by-year random intercept removes a further 0.044.</w:t>
+        <w:t xml:space="preserve">= 0.48). The accumulated-warming coefficient barely changes (1.394 → 1.440), and neither does the interaction (0.876 → 0.852), as H1 predicted. The remaining corrections are comparatively minor: treating structural zeros in the effort database as coverage gaps moves effort by −0.038; area-weighting the provincial climate series moves it by +0.029; the completeness offset restores +0.167, recovering signal that right-censoring had attenuated; and the province-by-year random intercept removes a further 0.038.</w:t>
       </w:r>
     </w:p>
     <w:p>
@@ -1578,7 +1578,7 @@
         <w:pStyle w:val="FirstParagraph"/>
       </w:pPr>
       <w:r>
-        <w:t xml:space="preserve">In the frozen main model, both drivers raise the hazard and the effect sizes are similar (Figure 1a; Table 2). One standard deviation of accumulated warming relative to a species’ historical range multiplies the annual hazard by 1.362 (95% CI 1.216–1.524;</w:t>
+        <w:t xml:space="preserve">In the frozen main model, both drivers raise the hazard and the effect sizes are similar (Figure 1a; Table 2). One standard deviation of accumulated warming relative to a species’ historical range multiplies the annual hazard by 1.365 (95% CI 1.219–1.528;</w:t>
       </w:r>
       <w:r>
         <w:t xml:space="preserve"> </w:t>
@@ -1594,7 +1594,7 @@
         <w:t xml:space="preserve"> </w:t>
       </w:r>
       <w:r>
-        <w:t xml:space="preserve">= 8.3 × 10⁻⁸); one standard deviation of survey effort multiplies it by 1.404 (1.245–1.583;</w:t>
+        <w:t xml:space="preserve">= 7.2 × 10⁻⁸); one standard deviation of survey effort multiplies it by 1.429 (1.268–1.611;</w:t>
       </w:r>
       <w:r>
         <w:t xml:space="preserve"> </w:t>
@@ -1610,7 +1610,7 @@
         <w:t xml:space="preserve"> </w:t>
       </w:r>
       <w:r>
-        <w:t xml:space="preserve">= 2.9 × 10⁻⁸). Annual climate variability has no effect (0.995, 0.909–1.090;</w:t>
+        <w:t xml:space="preserve">= 4.9 × 10⁻⁹). Annual climate variability has no effect (0.995, 0.908–1.089;</w:t>
       </w:r>
       <w:r>
         <w:t xml:space="preserve"> </w:t>
@@ -1626,7 +1626,7 @@
         <w:t xml:space="preserve"> </w:t>
       </w:r>
       <w:r>
-        <w:t xml:space="preserve">= 0.92). The two main effects interact negatively (0.849, 0.761–0.948;</w:t>
+        <w:t xml:space="preserve">= 0.91). The two main effects interact negatively (0.839, 0.752–0.936;</w:t>
       </w:r>
       <w:r>
         <w:t xml:space="preserve"> </w:t>
@@ -1642,15 +1642,15 @@
         <w:t xml:space="preserve"> </w:t>
       </w:r>
       <w:r>
-        <w:t xml:space="preserve">= 3.7 × 10⁻³): the marginal effect of warming is steepest where effort is low and flattens where coverage is already dense (Figure 1b).</w:t>
-      </w:r>
-    </w:p>
-    <w:p>
-      <w:pPr>
-        <w:pStyle w:val="BodyText"/>
-      </w:pPr>
-      <w:r>
-        <w:t xml:space="preserve">The warming coefficient must be read against a benchmark above unity. Permuting warming among species within a province-year, or the event indicator among species at risk, still returns 1.157–1.167, because both permutations preserve the covariance between provincial-annual climate and event counts. The observed 1.362 lies outside that null (</w:t>
+        <w:t xml:space="preserve">= 1.7 × 10⁻³): the marginal effect of warming is steepest where effort is low and flattens where coverage is already dense (Figure 1b).</w:t>
+      </w:r>
+    </w:p>
+    <w:p>
+      <w:pPr>
+        <w:pStyle w:val="BodyText"/>
+      </w:pPr>
+      <w:r>
+        <w:t xml:space="preserve">The warming coefficient must be read against a benchmark above unity. Permuting warming among species within a province-year, or the event indicator among species at risk, still returns about 1.16, because both permutations preserve the covariance between provincial-annual climate and event counts. The observed 1.365 lies outside that null (</w:t>
       </w:r>
       <w:r>
         <w:rPr>
@@ -1663,15 +1663,15 @@
         <w:t xml:space="preserve"> </w:t>
       </w:r>
       <w:r>
-        <w:t xml:space="preserve">= 0.005 for both), but only the increment, 1.362/1.157 ≈ 1.18, is attributable to referencing warming to each species’ range; the remainder is a baseline that the null shares. Effort behaves differently. Permuting it across years within a province collapses its hazard ratio to 0.980, with a null interval covering unity, so the effort effect arises from the timing of effort within provinces, and contrasts between provinces contribute little. A province-cluster bootstrap widens the Wald intervals to 1.20–1.72 for warming and 1.21–1.76 for effort; both lower bounds exceed unity, and the interaction stays below it (0.74–0.99).</w:t>
-      </w:r>
-    </w:p>
-    <w:p>
-      <w:pPr>
-        <w:pStyle w:val="BodyText"/>
-      </w:pPr>
-      <w:r>
-        <w:t xml:space="preserve">In natural units (Figure 4c), one standard deviation of accumulated warming is 0.179 °C: a province that has warmed by that much more than a species’ own historical Chinese range carries a 36% higher annual hazard for that species. Across the observed range of the variable (−0.65 to +0.61 °C), the implied hazard spans roughly ninefold. One standard deviation of survey effort corresponds to a 7.75-fold increase in annual provincial visits, from a median of 60 visits per year to about 465.</w:t>
+        <w:t xml:space="preserve">= 0.005 for both), but only the increment, 1.365/1.161 ≈ 1.18, is attributable to referencing warming to each species’ range; the remainder is a baseline that the null shares. Effort behaves differently. Permuting it across years within a province collapses its hazard ratio to 0.979, with a null interval covering unity, so the effort effect arises from the timing of effort within provinces, and contrasts between provinces contribute little. A province-cluster bootstrap widens the Wald intervals to 1.20–1.72 for warming and 1.24–1.78 for effort; both lower bounds exceed unity, and the interaction stays below it (0.73–0.99).</w:t>
+      </w:r>
+    </w:p>
+    <w:p>
+      <w:pPr>
+        <w:pStyle w:val="BodyText"/>
+      </w:pPr>
+      <w:r>
+        <w:t xml:space="preserve">In natural units (Figure 4c), one standard deviation of accumulated warming is 0.179 °C: a province that has warmed by that much more than a species’ own historical Chinese range carries a 36% higher annual hazard for that species. Across the observed range of the variable (−0.65 to +0.61 °C), the implied hazard spans roughly ninefold. One standard deviation of survey effort corresponds to a 7.89-fold increase in annual provincial visits, from a median of 60.5 visits per year to about 478.</w:t>
       </w:r>
     </w:p>
     <w:p>
@@ -1713,15 +1713,15 @@
         <w:pStyle w:val="BodyText"/>
       </w:pPr>
       <w:r>
-        <w:t xml:space="preserve">Four independent importance criteria agree that warming and effort are of comparable weight, with warming slightly ahead on discrimination (Figure 1c). Dropping accumulated warming costs 28.7 AIC units and 0.053 of marginal AUC; dropping survey effort costs 29.5 AIC units and 0.032 of marginal AUC. The interaction costs 6.5 AIC units. Dropping annual variability improves AIC by 2.0 units; we retain it as one half of a pre-specified decomposition.</w:t>
-      </w:r>
-    </w:p>
-    <w:p>
-      <w:pPr>
-        <w:pStyle w:val="BodyText"/>
-      </w:pPr>
-      <w:r>
-        <w:t xml:space="preserve">The discrimination ladder shows the same balance (Figure 1d). With the random structure held at the main model, fixed-effect-only AUC rises from 0.411 for the null model to 0.559 with effort alone, 0.580 with accumulated warming alone, and 0.610 with both. Climate alone discriminates better than effort alone; neither alone approaches the pair.</w:t>
+        <w:t xml:space="preserve">Four independent importance criteria agree that warming and effort are of comparable weight, with warming slightly ahead on discrimination (Figure 1c). Dropping accumulated warming costs 29.9 AIC units and 0.053 of marginal AUC; dropping survey effort costs 33.4 AIC units and 0.033 of marginal AUC. The interaction costs 7.8 AIC units. Dropping annual variability improves AIC by 2.0 units; we retain it as one half of a pre-specified decomposition.</w:t>
+      </w:r>
+    </w:p>
+    <w:p>
+      <w:pPr>
+        <w:pStyle w:val="BodyText"/>
+      </w:pPr>
+      <w:r>
+        <w:t xml:space="preserve">The discrimination ladder shows the same balance (Figure 1d). With the random structure held at the main model, fixed-effect-only AUC rises from 0.410 for the null model to 0.559 with effort alone, 0.580 with accumulated warming alone, and 0.610 with both. Climate alone discriminates better than effort alone; neither alone approaches the pair.</w:t>
       </w:r>
     </w:p>
     <w:bookmarkEnd w:id="26"/>
@@ -1739,7 +1739,7 @@
         <w:pStyle w:val="FirstParagraph"/>
       </w:pPr>
       <w:r>
-        <w:t xml:space="preserve">We evaluated six random-effect structures against four criteria, of which AIC is only one (Table 3; Supplementary Fig. S1). Adding a province-by-year intercept to the conventional species + province structure improves AIC by 93.4 units, raises conditional</w:t>
+        <w:t xml:space="preserve">We evaluated six random-effect structures against four criteria, of which AIC is only one (Table 3; Supplementary Fig. S1). Adding a province-by-year intercept to the conventional species + province structure improves AIC by 92.1 units, raises conditional</w:t>
       </w:r>
       <w:r>
         <w:t xml:space="preserve"> </w:t>
@@ -1752,15 +1752,15 @@
         <w:t xml:space="preserve">R</w:t>
       </w:r>
       <w:r>
-        <w:t xml:space="preserve">² from 0.274 to 0.411, raises conditional AUC from 0.721 to 0.854, and raises the intraclass correlation from 0.172 to 0.358. Marginal AUC, the discrimination attributable to the fixed effects, is flat across all six structures (0.607–0.613), so the added level absorbs observational heterogeneity without redistributing the fixed-effect signal, as H2 predicted.</w:t>
-      </w:r>
-    </w:p>
-    <w:p>
-      <w:pPr>
-        <w:pStyle w:val="BodyText"/>
-      </w:pPr>
-      <w:r>
-        <w:t xml:space="preserve">Two further structures were tested. A species-specific random slope on accumulated warming (ΔAIC 4.5 relative to the best) and a province-specific random slope on effort (ΔAIC 0.0, the AIC optimum) both fit marginally better, but both</w:t>
+        <w:t xml:space="preserve">² from 0.279 to 0.413, raises conditional AUC from 0.722 to 0.853, and raises the intraclass correlation from 0.172 to 0.356. Marginal AUC, the discrimination attributable to the fixed effects, is flat across all six structures (0.611–0.614), so the added level absorbs observational heterogeneity without redistributing the fixed-effect signal, as H2 predicted.</w:t>
+      </w:r>
+    </w:p>
+    <w:p>
+      <w:pPr>
+        <w:pStyle w:val="BodyText"/>
+      </w:pPr>
+      <w:r>
+        <w:t xml:space="preserve">Two further structures were tested. A species-specific random slope on accumulated warming (ΔAIC 2.6 relative to the best) and a province-specific random slope on effort (ΔAIC 0.0, the AIC optimum) both fit marginally better, but both</w:t>
       </w:r>
       <w:r>
         <w:t xml:space="preserve"> </w:t>
@@ -1789,7 +1789,7 @@
         <w:t xml:space="preserve">R</w:t>
       </w:r>
       <w:r>
-        <w:t xml:space="preserve">² (0.403 and 0.395 respectively, against 0.411 for the simpler structure), and their fixed effects are indistinguishable from those of the main model (effort 1.397 and 1.372; warming 1.348 and 1.366). We therefore froze the three-level intercept structure, the most parsimonious of the three statistically indistinguishable options and the one with the highest explanatory power. No variance component collapses in any structure (minimum standard deviation 0.274).</w:t>
+        <w:t xml:space="preserve">² (0.405 and 0.400 respectively, against 0.413 for the simpler structure), and their fixed effects are indistinguishable from those of the main model (effort 1.422 and 1.404; warming 1.351 and 1.368). We therefore froze the three-level intercept structure, the most parsimonious of the three statistically indistinguishable options and the one with the highest explanatory power. No variance component collapses in any structure (minimum standard deviation 0.272).</w:t>
       </w:r>
     </w:p>
     <w:bookmarkEnd w:id="27"/>
@@ -1819,7 +1819,7 @@
           <w:i/>
           <w:iCs/>
         </w:rPr>
-        <w:t xml:space="preserve">Species (SD 0.405).</w:t>
+        <w:t xml:space="preserve">Species (SD 0.404).</w:t>
       </w:r>
       <w:r>
         <w:t xml:space="preserve"> </w:t>
@@ -1837,7 +1837,7 @@
           <w:i/>
           <w:iCs/>
         </w:rPr>
-        <w:t xml:space="preserve">Province (SD 0.326).</w:t>
+        <w:t xml:space="preserve">Province (SD 0.332).</w:t>
       </w:r>
       <w:r>
         <w:t xml:space="preserve"> </w:t>
@@ -1855,13 +1855,13 @@
           <w:i/>
           <w:iCs/>
         </w:rPr>
-        <w:t xml:space="preserve">Province by year (SD 0.804).</w:t>
-      </w:r>
-      <w:r>
-        <w:t xml:space="preserve"> </w:t>
-      </w:r>
-      <w:r>
-        <w:t xml:space="preserve">This is the largest variance component in the model. One standard deviation multiplies the hazard by 2.23, more than either fixed effect, and the fitted levels span a thirteenfold range (Figure 5c). It represents the scale at which observation operates: a regional survey campaign, a provincial birding festival, a newly established protected area or a new local reporting channel raises the documentation rate for one province in one year. Because such pulses are not shared nationally, a model with only species and province intercepts cannot absorb them.</w:t>
+        <w:t xml:space="preserve">Province by year (SD 0.798).</w:t>
+      </w:r>
+      <w:r>
+        <w:t xml:space="preserve"> </w:t>
+      </w:r>
+      <w:r>
+        <w:t xml:space="preserve">This is the largest variance component in the model. One standard deviation multiplies the hazard by 2.22, more than either fixed effect, and the fitted levels span a thirteenfold range (Figure 5c). It represents the scale at which observation operates: a regional survey campaign, a provincial birding festival, a newly established protected area or a new local reporting channel raises the documentation rate for one province in one year. Because such pulses are not shared nationally, a model with only species and province intercepts cannot absorb them.</w:t>
       </w:r>
     </w:p>
     <w:p>
@@ -1879,7 +1879,7 @@
         <w:t xml:space="preserve"> </w:t>
       </w:r>
       <w:r>
-        <w:t xml:space="preserve">This known correction consumes no degrees of freedom; omitting it attenuates the effort coefficient from 1.372 to 1.245, because censoring is concentrated in the recent, high-effort years.</w:t>
+        <w:t xml:space="preserve">This known correction consumes no degrees of freedom; omitting it attenuates the effort coefficient from 1.404 to 1.264, because censoring is concentrated in the recent, high-effort years.</w:t>
       </w:r>
     </w:p>
     <w:bookmarkEnd w:id="28"/>
@@ -1905,7 +1905,7 @@
         <w:pStyle w:val="BodyText"/>
       </w:pPr>
       <w:r>
-        <w:t xml:space="preserve">The analysis uses the three groups with a known strategy: 137 resident, 72 partial-migrant and 107 long-distance-migrant species, carrying 218, 156 and 175 events. Species with no recorded strategy are excluded. Their event rate is 0.791% against 0.29–0.42% in the other groups, because a species without trait data entered the candidate pool only by virtue of having a record.</w:t>
+        <w:t xml:space="preserve">The analysis uses the three groups with a known strategy: 137 resident, 72 partial-migrant and 107 long-distance-migrant species, carrying 218, 156 and 175 events. Species with no recorded strategy are excluded. Their event rate is 0.792% against 0.29–0.42% in the other groups, because a species without trait data entered the candidate pool only by virtue of having a record.</w:t>
       </w:r>
     </w:p>
     <w:p>
@@ -1942,15 +1942,15 @@
         <w:t xml:space="preserve"> </w:t>
       </w:r>
       <w:r>
-        <w:t xml:space="preserve">= 0.693, 0.854, 0.899 and 0.256 respectively).</w:t>
-      </w:r>
-    </w:p>
-    <w:p>
-      <w:pPr>
-        <w:pStyle w:val="BodyText"/>
-      </w:pPr>
-      <w:r>
-        <w:t xml:space="preserve">Fitting each group separately agrees. Accumulated warming raises the hazard in every group: 1.363 (95% CI 1.158–1.605) in residents, 1.507 (1.244–1.826) in partial migrants and 1.514 (1.265–1.812) in long-distance migrants. Survey effort does too (1.293, 1.270 and 1.344). The intervals overlap almost completely; long-distance migrants, for which we expected warming to matter least, have the highest point estimate, though it is indistinguishable from the others. A warming × effort interaction confined to long-distance migrants, and the identifiability constraints of the stratified fits, are reported in Supplementary Note S2; because the test of group differences is not significant, we treat that pattern as a hypothesis still to be tested.</w:t>
+        <w:t xml:space="preserve">= 0.692, 0.638, 0.792 and 0.260 respectively).</w:t>
+      </w:r>
+    </w:p>
+    <w:p>
+      <w:pPr>
+        <w:pStyle w:val="BodyText"/>
+      </w:pPr>
+      <w:r>
+        <w:t xml:space="preserve">Fitting each group separately agrees. Accumulated warming raises the hazard in every group: 1.363 (95% CI 1.158–1.604) in residents, 1.511 (1.243–1.837) in partial migrants and 1.512 (1.264–1.809) in long-distance migrants. Survey effort does too (1.287, 1.338 and 1.333). The intervals overlap almost completely; long-distance migrants, for which we expected warming to matter least, have the highest point estimate, though it is indistinguishable from the others. A warming × effort interaction confined to long-distance migrants, and the identifiability constraints of the stratified fits, are reported in Supplementary Note S2; because the test of group differences is not significant, we treat that pattern as a hypothesis still to be tested.</w:t>
       </w:r>
     </w:p>
     <w:bookmarkEnd w:id="29"/>
@@ -1986,15 +1986,15 @@
         <w:t xml:space="preserve"> </w:t>
       </w:r>
       <w:r>
-        <w:t xml:space="preserve">The pool is the 1,445 Chinese bird species of the national ecological trait database; 1,312 match the dated Clements phylogeny, and 361 of these acquired at least one new provincial record, carrying 636 of the 657 events (Supplementary Note S3).</w:t>
-      </w:r>
-    </w:p>
-    <w:p>
-      <w:pPr>
-        <w:pStyle w:val="BodyText"/>
-      </w:pPr>
-      <w:r>
-        <w:t xml:space="preserve">Two effects hold under all three phylogenetic treatments: partial migrants are about twice as likely as residents to yield a new provincial record (odds ratio 1.91–2.50, all</w:t>
+        <w:t xml:space="preserve">The pool is the 1,445 Chinese bird species of the national ecological trait database, of which 1,312 match the dated Clements phylogeny and 361 acquired at least one new provincial record, carrying 636 of the 657 events (Supplementary Note S3).</w:t>
+      </w:r>
+    </w:p>
+    <w:p>
+      <w:pPr>
+        <w:pStyle w:val="BodyText"/>
+      </w:pPr>
+      <w:r>
+        <w:t xml:space="preserve">Two effects hold under all three phylogenetic treatments: partial migrants are about twice as likely as residents to yield a new provincial record (odds ratio 1.89–2.50, all</w:t>
       </w:r>
       <w:r>
         <w:t xml:space="preserve"> </w:t>
@@ -2010,7 +2010,7 @@
         <w:t xml:space="preserve"> </w:t>
       </w:r>
       <w:r>
-        <w:t xml:space="preserve">&lt; 0.001), and range size raises the odds by 1.23–1.46 per standard deviation. Partial migrants also carry the highest raw event rate in the hazard model (0.417% against 0.29–0.33%). Body mass, clutch size, habitat breadth, diet breadth, number of congeners, hand-wing index, IUCN status, endemism and trophic niche show no detectable effect. In mammals, by contrast, smaller-bodied, nocturnal and data-deficient species were more often newly recorded (Ding et al., 2025). A stratified fit recovers two group-specific patterns, including a vagrancy signature among full migrants (Supplementary Table S6); refitting without species whose traits were imputed leaves every conclusion intact (Supplementary Note S3).</w:t>
+        <w:t xml:space="preserve">&lt; 0.001), and range size raises the odds by 1.23–1.46 per standard deviation. Partial migrants also carry the highest raw event rate in the hazard model (0.418% against 0.29–0.33%). Body mass, clutch size, habitat breadth, diet breadth, number of congeners, hand-wing index, IUCN status, endemism and trophic niche show no detectable effect. In mammals, by contrast, smaller-bodied, nocturnal and data-deficient species were more often newly recorded (Ding et al., 2025). A stratified fit recovers two group-specific patterns, including a vagrancy signature among full migrants (Supplementary Table S6); refitting without species whose traits were imputed leaves every conclusion intact (Supplementary Note S3).</w:t>
       </w:r>
     </w:p>
     <w:p>
@@ -2097,7 +2097,7 @@
         <w:t xml:space="preserve"> </w:t>
       </w:r>
       <w:r>
-        <w:t xml:space="preserve">Counts of new records per province are overdispersed relative to Poisson (dispersion 5.60,</w:t>
+        <w:t xml:space="preserve">Counts of new records per province are overdispersed relative to Poisson (dispersion 5.59,</w:t>
       </w:r>
       <w:r>
         <w:t xml:space="preserve"> </w:t>
@@ -2113,7 +2113,7 @@
         <w:t xml:space="preserve"> </w:t>
       </w:r>
       <w:r>
-        <w:t xml:space="preserve">= 2.3 × 10⁻¹⁷); a negative binomial is adequate (1.24,</w:t>
+        <w:t xml:space="preserve">= 2.8 × 10⁻¹⁷); a negative binomial is adequate (1.23,</w:t>
       </w:r>
       <w:r>
         <w:t xml:space="preserve"> </w:t>
@@ -2129,7 +2129,7 @@
         <w:t xml:space="preserve"> </w:t>
       </w:r>
       <w:r>
-        <w:t xml:space="preserve">= 0.20, θ = 6.11) and passes simulation-based diagnostics. Only regional species richness is significant in the count model (incidence rate ratio 1.27,</w:t>
+        <w:t xml:space="preserve">= 0.20, θ = 6.12) and passes simulation-based diagnostics. Only regional species richness is significant in the count model (incidence rate ratio 1.27,</w:t>
       </w:r>
       <w:r>
         <w:t xml:space="preserve"> </w:t>
@@ -2145,7 +2145,7 @@
         <w:t xml:space="preserve"> </w:t>
       </w:r>
       <w:r>
-        <w:t xml:space="preserve">= 0.036). Treating recent effort as an offset makes the response a discovery rate per unit effort: provinces already well covered in 2002–2008 yield fewer records per unit of recent effort (0.71,</w:t>
+        <w:t xml:space="preserve">= 0.035). Treating recent effort as an offset makes the response a discovery rate per unit effort: provinces already well covered in 2002–2008 yield fewer records per unit of recent effort (0.70,</w:t>
       </w:r>
       <w:r>
         <w:t xml:space="preserve"> </w:t>
@@ -2161,7 +2161,7 @@
         <w:t xml:space="preserve"> </w:t>
       </w:r>
       <w:r>
-        <w:t xml:space="preserve">= 0.028), as do those with higher GDP per capita (0.61,</w:t>
+        <w:t xml:space="preserve">= 0.023), as do those with higher GDP per capita (0.61,</w:t>
       </w:r>
       <w:r>
         <w:t xml:space="preserve"> </w:t>
@@ -2177,7 +2177,7 @@
         <w:t xml:space="preserve"> </w:t>
       </w:r>
       <w:r>
-        <w:t xml:space="preserve">= 0.0027). Hierarchical partitioning attributes 51.2% of explained deviance to species richness, 33.3% to area and 9% to the effort terms; the full model explains 20.5%.</w:t>
+        <w:t xml:space="preserve">= 0.0026). Hierarchical partitioning attributes 51.2% of explained deviance to species richness, 32.9% to area and 9% to the effort terms; the full model explains 20.6%.</w:t>
       </w:r>
     </w:p>
     <w:p>
@@ -2243,7 +2243,7 @@
         <w:pStyle w:val="BodyText"/>
       </w:pPr>
       <w:r>
-        <w:t xml:space="preserve">Weighting the candidate provinces by their 2002–2024 survey visits adds the observation process to the null, and the departure that remains points north (χ² = 25.8,</w:t>
+        <w:t xml:space="preserve">Weighting the candidate provinces by their 2002–2024 survey visits adds the observation process to the null, and the departure that remains points north (χ² = 26.8,</w:t>
       </w:r>
       <w:r>
         <w:t xml:space="preserve"> </w:t>
@@ -2259,7 +2259,7 @@
         <w:t xml:space="preserve"> </w:t>
       </w:r>
       <w:r>
-        <w:t xml:space="preserve">= 0.001). Records fall to the northeast (179 against 153.2 expected) and northwest (31 against 17.9) more often, and to the east (237 against 263.9) and south (20 against 32.1) less often, than the distribution of survey effort predicts (Holm-adjusted</w:t>
+        <w:t xml:space="preserve">= 0.001). Records fall to the northeast (179 against 151.8 expected) and northwest (31 against 17.7) more often, and to the east (237 against 264.3) less often, than the distribution of survey effort predicts (Holm-adjusted</w:t>
       </w:r>
       <w:r>
         <w:t xml:space="preserve"> </w:t>
@@ -2275,7 +2275,10 @@
         <w:t xml:space="preserve"> </w:t>
       </w:r>
       <w:r>
-        <w:t xml:space="preserve">= 0.016–0.036). The three northern sectors hold 40.2% of records against 33.0% expected. Of the five best-sampled orders, only Passeriformes departs from both nulls under both placements of provinces (</w:t>
+        <w:t xml:space="preserve">= 0.016–0.024); the southern deficit (20 against 32.4) is marginal (Holm-adjusted</w:t>
+      </w:r>
+      <w:r>
+        <w:t xml:space="preserve"> </w:t>
       </w:r>
       <w:r>
         <w:rPr>
@@ -2288,15 +2291,28 @@
         <w:t xml:space="preserve"> </w:t>
       </w:r>
       <w:r>
-        <w:t xml:space="preserve">≤ 0.007), again with an excess in its northern sectors (38.7% against 30.4%); the four smaller orders are consistent with geometry or depart from it under only one placement (Supplementary Table S10; Supplementary Fig. S15).</w:t>
-      </w:r>
-    </w:p>
-    <w:p>
-      <w:pPr>
-        <w:pStyle w:val="BodyText"/>
-      </w:pPr>
-      <w:r>
-        <w:t xml:space="preserve">The eastward concentration of raw bearings therefore reflects China’s position relative to species’ global ranges and carries no information about observers or climate. Once geometry and effort are accounted for, new records lie modestly poleward of expectation, and placing each province at a point on its surface instead of at the mean position of its records gives the same result (χ² = 12.0 and 22.5).</w:t>
+        <w:t xml:space="preserve">= 0.050). The three northern sectors hold 40.2% of records against 32.8% expected. Of the five best-sampled orders, only Passeriformes departs from both nulls under both placements of provinces (</w:t>
+      </w:r>
+      <w:r>
+        <w:rPr>
+          <w:i/>
+          <w:iCs/>
+        </w:rPr>
+        <w:t xml:space="preserve">P</w:t>
+      </w:r>
+      <w:r>
+        <w:t xml:space="preserve"> </w:t>
+      </w:r>
+      <w:r>
+        <w:t xml:space="preserve">≤ 0.007), again with an excess in its northern sectors (38.7% against 30.0%); the four smaller orders are consistent with geometry or depart from it under only one placement (Supplementary Table S10; Supplementary Fig. S15).</w:t>
+      </w:r>
+    </w:p>
+    <w:p>
+      <w:pPr>
+        <w:pStyle w:val="BodyText"/>
+      </w:pPr>
+      <w:r>
+        <w:t xml:space="preserve">The eastward concentration of raw bearings therefore reflects China’s position relative to species’ global ranges and carries no information about observers or climate. Once geometry and effort are accounted for, new records lie modestly poleward of expectation, and placing each province at a point on its surface instead of at the mean position of its records gives the same result (χ² = 12.0 and 23.5).</w:t>
       </w:r>
     </w:p>
     <w:bookmarkEnd w:id="31"/>
@@ -2314,7 +2330,7 @@
         <w:pStyle w:val="FirstParagraph"/>
       </w:pPr>
       <w:r>
-        <w:t xml:space="preserve">The proportional-hazards assumption holds for accumulated warming (interaction with time β = −0.022,</w:t>
+        <w:t xml:space="preserve">The proportional-hazards assumption holds for accumulated warming (interaction with time β &lt; 0.001,</w:t>
       </w:r>
       <w:r>
         <w:t xml:space="preserve"> </w:t>
@@ -2330,7 +2346,7 @@
         <w:t xml:space="preserve"> </w:t>
       </w:r>
       <w:r>
-        <w:t xml:space="preserve">= 0.82) but not for effort (β = −0.211,</w:t>
+        <w:t xml:space="preserve">= 1.00) but not for effort (β = −0.190,</w:t>
       </w:r>
       <w:r>
         <w:t xml:space="preserve"> </w:t>
@@ -2346,7 +2362,7 @@
         <w:t xml:space="preserve"> </w:t>
       </w:r>
       <w:r>
-        <w:t xml:space="preserve">= 7.7 × 10⁻⁴), and the departure is itself a result. Allowing the effort coefficient to vary through time, its hazard ratio falls from 2.18 (95% CI 1.63–2.90) in 2002 to 1.07 (0.88–1.30) in 2024, crossing into non-significance in the early 2020s (Figure 5d). An additional standard deviation of effort now yields far fewer first records than it did at the start of the period. The warming term shows no such decline, as H4 predicted, although we did not test the two time interactions against each other.</w:t>
+        <w:t xml:space="preserve">= 2.1 × 10⁻³), and the departure is itself a result. Allowing the effort coefficient to vary through time, its hazard ratio falls from 2.14 (95% CI 1.61–2.85) in 2002 to 1.13 (0.93–1.37) in 2024, crossing into non-significance in the early 2020s (Figure 5d). An additional standard deviation of effort now yields far fewer first records than it did at the start of the period. The warming term shows no such decline, as H4 predicted, although we did not test the two time interactions against each other.</w:t>
       </w:r>
     </w:p>
     <w:bookmarkEnd w:id="32"/>
@@ -2382,7 +2398,7 @@
         <w:t xml:space="preserve"> </w:t>
       </w:r>
       <w:r>
-        <w:t xml:space="preserve">Raising the requirement from 50 to 200 suitable cells (about 0.9 to 3.7 thousand km²) changes the risk set from 175,901 to 155,435 rows but leaves the coefficients essentially fixed (effort 1.404, 1.405, 1.411; warming 1.362, 1.376, 1.372; interaction 0.849, 0.851, 0.850).</w:t>
+        <w:t xml:space="preserve">Raising the requirement from 50 to 200 suitable cells (about 0.9 to 3.7 thousand km²) changes the risk set from 175,640 to 155,207 rows but leaves the coefficients essentially fixed (effort 1.429, 1.431, 1.437; warming 1.365, 1.379, 1.375; interaction 0.839, 0.840, 0.839).</w:t>
       </w:r>
     </w:p>
     <w:p>
@@ -2400,7 +2416,7 @@
         <w:t xml:space="preserve"> </w:t>
       </w:r>
       <w:r>
-        <w:t xml:space="preserve">Annual mean temperature carries the signal; warmest-month maximum temperature carries a weaker version of it (hazard ratio 1.30, ΔAIC 9.0 behind the best cell) but shows no interaction with effort; coldest-month minimum temperature and winter mean temperature show no signal at any window (hazard ratios 0.96–1.08, all</w:t>
+        <w:t xml:space="preserve">Annual mean temperature carries the signal; warmest-month maximum temperature carries a weaker version of it (hazard ratio 1.30, ΔAIC 10.4 behind the best cell) but shows no interaction with effort; coldest-month minimum temperature and winter mean temperature show no signal at any window (hazard ratios 0.96–1.08, all</w:t>
       </w:r>
       <w:r>
         <w:t xml:space="preserve"> </w:t>
@@ -2416,7 +2432,7 @@
         <w:t xml:space="preserve"> </w:t>
       </w:r>
       <w:r>
-        <w:t xml:space="preserve">&gt; 0.12).</w:t>
+        <w:t xml:space="preserve">&gt; 0.11).</w:t>
       </w:r>
     </w:p>
     <w:p>
@@ -2434,7 +2450,7 @@
         <w:t xml:space="preserve"> </w:t>
       </w:r>
       <w:r>
-        <w:t xml:space="preserve">We tested windows of 5, 10, 15 and 20 years against 1980–2000 and 1970–2000 baselines (Supplementary Note S5; Supplementary Fig. S2). The warming coefficient rises with window length in every series, from 1.16–1.21 at five years to 1.36–1.40 at twenty, as expected of a process that integrates climate over decades. A 3–23-year grid (Supplementary Table S8) places the optimum at 18–20 years; the pre-specified 15 years lies within 2.2–5.6 AIC units of it. The effort coefficient is flat at 1.34–1.41 and the interaction negative throughout (0.82–1.00), so the two terms are separately identified. The baseline changes the estimate only modestly: at</w:t>
+        <w:t xml:space="preserve">We tested windows of 5, 10, 15 and 20 years against 1980–2000 and 1970–2000 baselines (Supplementary Note S5; Supplementary Fig. S2). The warming coefficient rises with window length in every series, from 1.16–1.22 at five years to 1.38–1.40 at twenty, as expected of a process that integrates climate over decades. A 3–23-year grid (Supplementary Table S8) places the optimum at 18–20 years; the pre-specified 15 years lies within 2.1–6.0 AIC units of it. The effort coefficient is flat at 1.37–1.43 and the interaction negative throughout (0.82–0.96), so the two terms are separately identified. The baseline changes the estimate only modestly: at</w:t>
       </w:r>
       <w:r>
         <w:t xml:space="preserve"> </w:t>
@@ -2450,7 +2466,7 @@
         <w:t xml:space="preserve"> </w:t>
       </w:r>
       <w:r>
-        <w:t xml:space="preserve">= 15 the hazard ratio is 1.361 under CRU 1970–2000 and 1.307 under CRU 1980–2000, and the main estimate (1.362) is within 0.001 of the former. Because the 0.5° CRU grid smooths topography, one standard deviation of accumulated warming is 0.058 °C in the CRU series against 0.179 °C in the main one; natural-unit statements refer to the latter.</w:t>
+        <w:t xml:space="preserve">= 15 the hazard ratio is 1.366 under CRU 1970–2000 and 1.319 under CRU 1980–2000, and the main estimate (1.365) differs from the former by 0.001. Because the 0.5° CRU grid smooths topography, one standard deviation of accumulated warming is 0.058 °C in the CRU series against 0.179 °C in the main one; natural-unit statements refer to the latter.</w:t>
       </w:r>
     </w:p>
     <w:p>
@@ -2468,7 +2484,7 @@
         <w:t xml:space="preserve"> </w:t>
       </w:r>
       <w:r>
-        <w:t xml:space="preserve">All twelve combinations of four proxies (visits, observers, birding days, records) and three treatments of the 24 implausible zero cells (coverage gap, bounded within-province interpolation, zero-filling) give effort hazard ratios between 1.25 and 1.52 and warming hazard ratios between 1.35 and 1.37.</w:t>
+        <w:t xml:space="preserve">All twelve combinations of four proxies (visits, observers, birding days, records) and three treatments of the 24 implausible zero cells (coverage gap, bounded within-province interpolation, zero-filling) give effort hazard ratios between 1.25 and 1.55 and warming hazard ratios between 1.33 and 1.39.</w:t>
       </w:r>
     </w:p>
     <w:bookmarkEnd w:id="33"/>
@@ -2502,7 +2518,7 @@
         <w:t xml:space="preserve"> </w:t>
       </w:r>
       <w:r>
-        <w:t xml:space="preserve">= 0.74), dispersion is correct (</w:t>
+        <w:t xml:space="preserve">= 0.86), dispersion is correct (</w:t>
       </w:r>
       <w:r>
         <w:rPr>
@@ -2515,7 +2531,7 @@
         <w:t xml:space="preserve"> </w:t>
       </w:r>
       <w:r>
-        <w:t xml:space="preserve">= 0.59) and there is no zero inflation (</w:t>
+        <w:t xml:space="preserve">= 0.51) and there is no zero inflation (</w:t>
       </w:r>
       <w:r>
         <w:rPr>
@@ -2528,7 +2544,7 @@
         <w:t xml:space="preserve"> </w:t>
       </w:r>
       <w:r>
-        <w:t xml:space="preserve">= 0.59). Two of 23 year levels and two of 31 province levels show within-group deviation at</w:t>
+        <w:t xml:space="preserve">= 0.52). None of 23 year levels and three of 31 province levels show within-group deviation at</w:t>
       </w:r>
       <w:r>
         <w:t xml:space="preserve"> </w:t>
@@ -2544,7 +2560,7 @@
         <w:t xml:space="preserve"> </w:t>
       </w:r>
       <w:r>
-        <w:t xml:space="preserve">&lt; 0.05, close to the nominal rate. Province-mean residuals show no spatial autocorrelation (Moran’s</w:t>
+        <w:t xml:space="preserve">&lt; 0.05, consistent with the nominal rate. Province-mean residuals show no spatial autocorrelation (Moran’s</w:t>
       </w:r>
       <w:r>
         <w:t xml:space="preserve"> </w:t>
@@ -2560,7 +2576,7 @@
         <w:t xml:space="preserve"> </w:t>
       </w:r>
       <w:r>
-        <w:t xml:space="preserve">= −0.038 against an expectation of −0.033; permutation</w:t>
+        <w:t xml:space="preserve">= −0.042 against an expectation of −0.033; permutation</w:t>
       </w:r>
       <w:r>
         <w:t xml:space="preserve"> </w:t>
@@ -2576,7 +2592,7 @@
         <w:t xml:space="preserve"> </w:t>
       </w:r>
       <w:r>
-        <w:t xml:space="preserve">= 0.86). The outlier test is significant (95 outliers,</w:t>
+        <w:t xml:space="preserve">= 0.76). The outlier test is significant (86 outliers,</w:t>
       </w:r>
       <w:r>
         <w:t xml:space="preserve"> </w:t>
@@ -2600,7 +2616,7 @@
         <w:pStyle w:val="BodyText"/>
       </w:pPr>
       <w:r>
-        <w:t xml:space="preserve">Three resampling analyses complete the assessment (Supplementary Fig. S11). The design-preserving nulls place every reported coefficient except annual climate variability outside its null. A 300-resample cluster bootstrap shows that provincial clustering inflates standard errors 1.26–1.59-fold and species clustering does not (0.86–1.17); Table 2 reports both intervals. A 150-simulation parametric bootstrap recovers the coefficients with bias below 0.01 on the log-hazard scale and coverage of 91.3–95.3%. Leaving out each province, or each of ten species deciles, moves the coefficients by at most 4.2%, so no single province or species group carries the result. A refit allowing both focal effects to vary through time is reported in Supplementary Note S4.</w:t>
+        <w:t xml:space="preserve">Three resampling analyses complete the assessment (Supplementary Fig. S11). The design-preserving nulls place every reported coefficient except annual climate variability outside its null. A 300-resample cluster bootstrap shows that provincial clustering inflates standard errors 1.30–1.53-fold and species clustering does not (0.89–1.19); Table 2 reports both intervals. A 150-simulation parametric bootstrap recovers the coefficients with bias below 0.01 on the log-hazard scale and coverage of 92.0–93.3%. Leaving out each province, or each of ten species deciles, moves the coefficients by at most 3.9%, so no single province or species group carries the result. A refit allowing both focal effects to vary through time is reported in Supplementary Note S4.</w:t>
       </w:r>
     </w:p>
     <w:bookmarkEnd w:id="34"/>
@@ -2618,47 +2634,47 @@
         <w:pStyle w:val="FirstParagraph"/>
       </w:pPr>
       <w:r>
-        <w:t xml:space="preserve">We projected the fitted hazard under SSP2-4.5 and SSP5-8.5 for 2030, 2050 and 2080 (Materials and Methods) and asked how much of each scenario lies inside the range over which the model was fitted (Figure 7b).</w:t>
-      </w:r>
-    </w:p>
-    <w:p>
-      <w:pPr>
-        <w:pStyle w:val="BodyText"/>
-      </w:pPr>
-      <w:r>
-        <w:t xml:space="preserve">The historical species-specific gradient has a standard deviation of only 0.18 °C, because provincial and range-wide anomalies largely move together. Future province-minus-range warming differentials reach 2 °C, more than ten standard deviations beyond the fitted range. Consequently, only 47.8% of species-province cells fall inside the fitted covariate support under SSP2-4.5 in 2030, 10.4% in 2050 and 2.1% in 2080; under SSP5-8.5 the corresponding figures are 34.2%, 2.1% and 1.9%.</w:t>
-      </w:r>
-    </w:p>
-    <w:p>
-      <w:pPr>
-        <w:pStyle w:val="BodyText"/>
-      </w:pPr>
-      <w:r>
-        <w:t xml:space="preserve">Restricted to cells inside the support, the mechanistic model projects hazard ratios relative to 2024 of 0.79 to 2.94 (Supplementary Fig. S6). Applied without the mask, the same model produces ratios up to 78 (Supplementary Fig. S10).</w:t>
-      </w:r>
-    </w:p>
-    <w:p>
-      <w:pPr>
-        <w:pStyle w:val="BodyText"/>
-      </w:pPr>
-      <w:r>
-        <w:t xml:space="preserve">A gradient-boosted model fitted to the same three predictors shows why the support matters. Within the observed range the two model families track each other across province-years (Spearman ρ = 0.54); outside it they agree on the direction of change in only 23.7% of cells, falling to 6.5% under SSP5-8.5 in 2080 (Figure 7c). The cause is structural: tree ensembles saturate once covariates leave the training support, whereas the complementary log-log model extrapolates linearly on the log-hazard scale. TreeSHAP attributions within the training range are monotone for both drivers (Supplementary Fig. S8).</w:t>
-      </w:r>
-    </w:p>
-    <w:p>
-      <w:pPr>
-        <w:pStyle w:val="BodyText"/>
-      </w:pPr>
-      <w:r>
-        <w:t xml:space="preserve">With climate and survey effort as independent scenario axes (Supplementary Fig. S17), freezing effort at its 2024 level and switching from SSP2-4.5 to SSP5-8.5 leaves the national expectation essentially unchanged (23.2 versus 23.1 first records per year in 2030; 23.6 versus 23.7 in 2050), whereas effort growing at 0.6 SD per decade, half the observed pace, raises the 2050 expectation to 57–62 records per year with only 2% of species–province cells still inside the fitted support (40–44% under frozen effort). The projected number of records is governed by the effort scenario, and its increase lies almost entirely outside the fitted support.</w:t>
-      </w:r>
-    </w:p>
-    <w:p>
-      <w:pPr>
-        <w:pStyle w:val="BodyText"/>
-      </w:pPr>
-      <w:r>
-        <w:t xml:space="preserve">Random forest and XGBoost models fitted under identical validation designs lead the mechanistic model on leave-species folds but trail it on temporal and leave-one-province prediction, and all three families agree on where the next records will fall (Spearman ρ 0.62–0.90; Supplementary Note S7; Supplementary Figs S18, S19). On the same scenario grid they diverge sharply (Supplementary Figs S20, S21): calibrated to a common 2024 total, the mechanistic model reaches 57.4 records per year under SSP2-4.5 with continued effort growth in 2050, the random forest stays at 23.0 and XGBoost falls to 6.1, differences produced by boundary leaves that the data cannot adjudicate.</w:t>
+        <w:t xml:space="preserve">We projected the fitted hazard under SSP2-4.5 and SSP5-8.5 for 2030, 2050 and 2080 and asked how much of each scenario lies inside the range over which the model was fitted (Figure 7b).</w:t>
+      </w:r>
+    </w:p>
+    <w:p>
+      <w:pPr>
+        <w:pStyle w:val="BodyText"/>
+      </w:pPr>
+      <w:r>
+        <w:t xml:space="preserve">The historical species-specific gradient has a standard deviation of only 0.18 °C, whereas future province-minus-range differentials reach 2 °C, and effort leaves its fitted range sooner still because its 2024 level is already the highest observed. Only 45.7% of species-province cells fall inside the fitted covariate support under SSP2-4.5 in 2030, 6.3% in 2050 and none in 2080; under SSP5-8.5, 30.3% in 2030 and none thereafter.</w:t>
+      </w:r>
+    </w:p>
+    <w:p>
+      <w:pPr>
+        <w:pStyle w:val="BodyText"/>
+      </w:pPr>
+      <w:r>
+        <w:t xml:space="preserve">Restricted to cells inside the support, the mechanistic model projects hazard ratios relative to 2024 of 0.95 to 1.50 (Supplementary Fig. S6). Applied without the mask, the same model produces ratios up to 88 (Supplementary Fig. S10).</w:t>
+      </w:r>
+    </w:p>
+    <w:p>
+      <w:pPr>
+        <w:pStyle w:val="BodyText"/>
+      </w:pPr>
+      <w:r>
+        <w:t xml:space="preserve">A gradient-boosted model fitted to the same three predictors shows why the support matters. Within the observed range the two model families track each other across province-years (Spearman ρ = 0.56); outside it they agree on the direction of change in only 8.6% of cells, and in none under SSP5-8.5 in 2080 (Figure 7c). The cause is structural: tree ensembles saturate once covariates leave the training support, whereas the complementary log-log model extrapolates linearly on the log-hazard scale. TreeSHAP attributions within the training range are monotone for both drivers (Supplementary Fig. S8).</w:t>
+      </w:r>
+    </w:p>
+    <w:p>
+      <w:pPr>
+        <w:pStyle w:val="BodyText"/>
+      </w:pPr>
+      <w:r>
+        <w:t xml:space="preserve">With climate and survey effort as independent scenario axes (Supplementary Fig. S17), freezing effort at its 2024 level and switching from SSP2-4.5 to SSP5-8.5 leaves the national expectation essentially unchanged (26.1 versus 25.9 first records per year in 2030; 26.8 versus 26.9 in 2050), whereas effort growing at 0.6 SD per decade, half the observed pace, raises the 2050 expectation to 79–89 records per year with no species–province cell left inside the fitted support (38–43% under frozen effort). The projected number of records is governed by the effort scenario, and its increase lies entirely outside the fitted support.</w:t>
+      </w:r>
+    </w:p>
+    <w:p>
+      <w:pPr>
+        <w:pStyle w:val="BodyText"/>
+      </w:pPr>
+      <w:r>
+        <w:t xml:space="preserve">Random forest and XGBoost models fitted under identical validation designs lead the mechanistic model on leave-species folds but trail it on temporal and leave-one-province prediction, and all three families agree on where the next records will fall (Spearman ρ 0.59–0.89; Supplementary Note S7; Supplementary Figs S18, S19). On the same scenario grid they diverge sharply (Supplementary Figs S20, S21): calibrated to a common 2024 total, the mechanistic model reaches 79.3 records per year under SSP2-4.5 with continued effort growth in 2050, the random forest stays at 23.9 and XGBoost falls to 7.4, differences produced by boundary leaves that the data cannot adjudicate.</w:t>
       </w:r>
     </w:p>
     <w:bookmarkEnd w:id="35"/>
@@ -2724,39 +2740,39 @@
         <w:pStyle w:val="FirstParagraph"/>
       </w:pPr>
       <w:r>
-        <w:t xml:space="preserve">New provincial bird records in China reflect both the movement of birds and the growth of birdwatching, in similar measure. Once records are dated to discovery and observation is modelled explicitly, a standard deviation of warming relative to a species’ historical range raises the annual hazard of a first record about as much as a standard deviation of survey effort (hazard ratios 1.36 and 1.40). Which of the two appears to dominate depends on a field that analyses of such compilations seldom question: the date. We had expected effort to dominate, given the growth of birdwatching and the association of new mammal records with survey effort (Ding et al., 2025); that expectation held only under publication-year dating.</w:t>
-      </w:r>
-    </w:p>
-    <w:p>
-      <w:pPr>
-        <w:pStyle w:val="BodyText"/>
-      </w:pPr>
-      <w:r>
-        <w:t xml:space="preserve">Publication dating biases estimates in a predictable direction (H1). Publication lags discovery by about two years and observation grew every year, so a record dated to publication is credited to a year in which more people were looking than when the bird was found, and the error favours whichever covariate trends with observer numbers. The same shift detaches a record from the weather of its discovery year, which is how a spurious effect of annual climate variability arises. The problem extends beyond new records: most new plant species are described from specimens collected years or decades earlier (Bebber et al., 2010), and assessments of alien-species accumulation rest on dated first records (Seebens et al., 2017). Any analysis relating such series to trending covariates is exposed to the same bias. The first remedy is to record the date of observation, as CBNR does. Where that is impossible, a completeness offset like ours, the discrete-time counterpart of the reporting-delay adjustments used in epidemiological surveillance (Lawless, 1994), corrects the expected hazard for records not yet published.</w:t>
-      </w:r>
-    </w:p>
-    <w:p>
-      <w:pPr>
-        <w:pStyle w:val="BodyText"/>
-      </w:pPr>
-      <w:r>
-        <w:t xml:space="preserve">The two drivers also behave differently through time. The return on effort fell from 2.18 in 2002 to 1.07 in 2024, and provinces that were well surveyed in 2002–2008 later yielded fewer records per unit of effort, whereas the return on warming showed no detectable change (H4). We read this as the difference between a stock and a flow. Effort draws down a stock of occurrences that were detectable but undocumented, the Wallacean shortfall; warming keeps adding to it as the climate of each province moves relative to species’ ranges. The negative interaction (H3) fits the same reading: where effort has long been high, many of the species that warming favours have already been recorded, and the pairs left at risk respond less. Depletion of this kind is expected in hazard analyses, because the most susceptible units leave the risk set first (Hernán, 2010). Geography offers an alternative: sparsely surveyed provinces are disproportionately western and montane, where steep gradients may make a given amount of warming more consequential, and this alone could produce a negative interaction. Nor did we test the two time trends against each other. If the stock-and-flow reading is correct, the share of new records that reflects redistribution will grow as the stock is exhausted, and new-record series will become more informative about climate, provided that their dating and the observation process are modelled.</w:t>
-      </w:r>
-    </w:p>
-    <w:p>
-      <w:pPr>
-        <w:pStyle w:val="BodyText"/>
-      </w:pPr>
-      <w:r>
-        <w:t xml:space="preserve">The warming coefficient also needs the right benchmark. Permutations that retain provincial-annual climate but scramble species identity still return a hazard ratio of about 1.16, so the component attributable to referencing warming to each species’ own range is about 1.18. The rest is an association between provincial climate and the number of records in a province-year, which may be climatic or observational and which a species-blind analysis would reproduce. Direction makes the same point more sharply: the apparent eastward concentration of new records is what China’s position relative to species’ global ranges produces when records fall at random among candidate provinces. Against a null that also follows survey effort, records lie further north than expected, with 40.2% in the three northern sectors against 33.0%. Directional readings of new records (Xing et al., 2024; Chen et al., 2025) therefore need a geometric and observational benchmark; against one, the poleward signal in these data is detectable but modest.</w:t>
-      </w:r>
-    </w:p>
-    <w:p>
-      <w:pPr>
-        <w:pStyle w:val="BodyText"/>
-      </w:pPr>
-      <w:r>
-        <w:t xml:space="preserve">Projection meets a different limit. Because the species-referenced gradient varied little in the past, late-century scenarios push about 98% of species–province cells outside the fitted support, where the mechanistic and machine-learning models agree on the direction of change in fewer than a quarter of cells. The scenario projections also apply the effort coefficient estimated over the whole period, although its value had fallen to 1.07 by 2024, so the effort-driven rise they imply is an upper bound. Projections of record generation, and of other indicators built on species-specific climate differentials, should report the share of projected cells inside the fitted support (Elith et al., 2010; Mesgaran et al., 2014; Yates et al., 2018). Where that share is small, a near-term surface with an explicit support mask is more defensible than a century-scale map.</w:t>
+        <w:t xml:space="preserve">New provincial bird records in China reflect both the movement of birds and the growth of birdwatching, in similar measure. Once records are dated to discovery and observation is modelled explicitly, a standard deviation of warming relative to a species’ historical range raises the annual hazard of a first record about as much as a standard deviation of survey effort (hazard ratios 1.36 and 1.43). Which of the two appears to dominate depends on a field that analyses of such compilations seldom question: the date. We had expected effort to dominate, given the growth of birdwatching and the association of new mammal records with survey effort (Ding et al., 2025); that expectation held only under publication-year dating.</w:t>
+      </w:r>
+    </w:p>
+    <w:p>
+      <w:pPr>
+        <w:pStyle w:val="BodyText"/>
+      </w:pPr>
+      <w:r>
+        <w:t xml:space="preserve">Publication dating biases estimates in a predictable direction (H1). Publication lags discovery by about two years and observation grew almost every year, so a record dated to publication is credited to a year in which more people were looking than when the bird was found, and the error favours whichever covariate trends with observer numbers. The same shift detaches a record from the weather of its discovery year, which is how a spurious effect of annual climate variability arises. The problem extends beyond new records: most new plant species are described from specimens collected years or decades earlier (Bebber et al., 2010), and assessments of alien-species accumulation rest on dated first records (Seebens et al., 2017). Any analysis relating such series to trending covariates is exposed to the same bias. The first remedy is to record the date of observation, as CBNR does. Where that is impossible, a completeness offset like ours, the discrete-time counterpart of the reporting-delay adjustments used in epidemiological surveillance (Lawless, 1994), corrects the expected hazard for records not yet published.</w:t>
+      </w:r>
+    </w:p>
+    <w:p>
+      <w:pPr>
+        <w:pStyle w:val="BodyText"/>
+      </w:pPr>
+      <w:r>
+        <w:t xml:space="preserve">The two drivers also behave differently through time. The return on effort fell from 2.14 in 2002 to 1.13 in 2024, and provinces that were well surveyed in 2002–2008 later yielded fewer records per unit of effort, whereas the return on warming showed no detectable change (H4). We read this as the difference between a stock and a flow. Effort draws down a stock of occurrences that were detectable but undocumented, the Wallacean shortfall; warming keeps adding to it as the climate of each province moves relative to species’ ranges. The negative interaction (H3) fits the same reading: where effort has long been high, many of the species that warming favours have already been recorded, and the pairs left at risk respond less. Depletion of this kind is expected in hazard analyses, because the most susceptible units leave the risk set first (Hernán, 2010). Geography offers an alternative: sparsely surveyed provinces are disproportionately western and montane, where steep gradients may make a given amount of warming more consequential, and this alone could produce a negative interaction. Nor did we test the two time trends against each other. If the stock-and-flow reading is correct, the share of new records that reflects redistribution will grow as the stock is exhausted, and new-record series will become more informative about climate, provided that their dating and the observation process are modelled.</w:t>
+      </w:r>
+    </w:p>
+    <w:p>
+      <w:pPr>
+        <w:pStyle w:val="BodyText"/>
+      </w:pPr>
+      <w:r>
+        <w:t xml:space="preserve">The warming coefficient also needs the right benchmark. Permutations that retain provincial-annual climate but scramble species identity still return a hazard ratio of about 1.16, so the component attributable to referencing warming to each species’ own range is about 1.18. The rest is an association between provincial climate and the number of records in a province-year, which may be climatic or observational and which a species-blind analysis would reproduce. Direction makes the same point more sharply: the apparent eastward concentration of new records is what China’s position relative to species’ global ranges produces when records fall at random among candidate provinces. Against a null that also follows survey effort, records lie further north than expected, with 40.2% in the three northern sectors against 32.8%. Directional readings of new records (Xing et al., 2024; Chen et al., 2025) therefore need a geometric and observational benchmark; against one, the poleward signal in these data is detectable but modest.</w:t>
+      </w:r>
+    </w:p>
+    <w:p>
+      <w:pPr>
+        <w:pStyle w:val="BodyText"/>
+      </w:pPr>
+      <w:r>
+        <w:t xml:space="preserve">Projection meets a different limit. Because the species-referenced gradient varied little and effort is projected past its observed peak, late-century scenarios push all species–province cells outside the fitted support, where the mechanistic and machine-learning models agree on the direction of change in fewer than one cell in ten. The scenario projections also apply the effort coefficient estimated over the whole period, although its value had fallen to 1.13 by 2024, so the effort-driven rise they imply is an upper bound. Projections of record generation, and of other indicators built on species-specific climate differentials, should report the share of projected cells inside the fitted support (Elith et al., 2010; Mesgaran et al., 2014; Yates et al., 2018). Where that share is small, a near-term surface with an explicit support mask is more defensible than a century-scale map.</w:t>
       </w:r>
     </w:p>
     <w:p>
@@ -2772,7 +2788,7 @@
         <w:pStyle w:val="BodyText"/>
       </w:pPr>
       <w:r>
-        <w:t xml:space="preserve">A province-year pulse of one standard deviation multiplies the hazard of a first record by 2.23, more than either driver, so survey campaigns change the biodiversity record quickly and should be placed deliberately. Because effort acts on a logarithmic scale and well-surveyed provinces yield fewer records per unit of new effort, additional visits document most where surveys are sparse, which is also where warming raises the hazard most; existing reserves in the upper tercile of warming and the lower tercile of recent effort (3.93 × 10⁵ km²) are a practical starting point. Because the return on effort has fallen within two decades, a plateau in new records should not be taken to mean that redistribution has slowed. Records inside nature reserves track where people watch birds and should not be used to score reserve performance. Finally, compilers of new-record data can make every later analysis more reliable, at little cost, by publishing both the date of observation and the date of publication for each record.</w:t>
+        <w:t xml:space="preserve">A province-year pulse of one standard deviation multiplies the hazard of a first record by 2.22, more than either driver, so survey campaigns change the biodiversity record quickly and should be placed deliberately. Because effort acts on a logarithmic scale and well-surveyed provinces yield fewer records per unit of new effort, additional visits document most where surveys are sparse, which is also where warming raises the hazard most; existing reserves in the upper tercile of warming and the lower tercile of recent effort (3.93 × 10⁵ km²) are a practical starting point. Because the return on effort has fallen within two decades, a plateau in new records should not be taken to mean that redistribution has slowed. Records inside nature reserves track where people watch birds and should not be used to score reserve performance. Finally, compilers of new-record data can make every later analysis more reliable, at little cost, by publishing both the date of observation and the date of publication for each record.</w:t>
       </w:r>
     </w:p>
     <w:bookmarkEnd w:id="38"/>
@@ -2826,7 +2842,7 @@
         <w:pStyle w:val="FirstParagraph"/>
       </w:pPr>
       <w:r>
-        <w:t xml:space="preserve">The new-record data analysed in this study are version 2 of the China Bird New Record dataset (CBNR), openly available under a CC BY 4.0 licence in Zenodo at https://doi.org/10.5281/zenodo.20809949 (Ding et al., 2026). Nature-reserve boundaries are openly available in Zenodo at https://doi.org/10.5281/zenodo.14875797 (China Nature Reserve Specimen Resource Sharing Platform, 2024). Historical monthly climate (WorldClim 2.1 downscaling of CRU TS 4.09; Fick &amp; Hijmans, 2017; Harris et al., 2020) and CMIP6 projections are publicly available from WorldClim (https://www.worldclim.org). Species range maps (BirdLife International &amp; Handbook of the Birds of the World, 2024) are available on request from BirdLife International (http://datazone.birdlife.org/species/requestdis); their licence does not permit redistribution. Survey-effort indicators were derived from eBird/GBIF occurrence records and China Bird Report checklists (http://www.birdreport.cn); the raw records remain subject to their providers’ terms, and the province-year effort panel is provided in the project repository. All analysis code (R 4.5.1), the risk set, the derived climate and effort panels and every result table are available at https://github.com/dingchenchen6/bird-newrecord-discovery-dated (Ding, 2026) and will be archived in Zenodo with a DOI upon acceptance; the model equations and all parameter estimates are given in Materials and Methods and Supporting Information.</w:t>
+        <w:t xml:space="preserve">The new-record data analysed in this study are version 2 of the China Bird New Record dataset (CBNR), openly available under a CC BY 4.0 licence in Zenodo at https://doi.org/10.5281/zenodo.20809949 (Ding et al., 2026). Nature-reserve boundaries are openly available in Zenodo at https://doi.org/10.5281/zenodo.14875797 (China Nature Reserve Specimen Resource Sharing Platform, 2024). Historical monthly climate (WorldClim 2.1 downscaling of CRU TS 4.09; Fick &amp; Hijmans, 2017; Harris et al., 2020) and CMIP6 projections are publicly available from WorldClim (https://www.worldclim.org). Species range maps (BirdLife International &amp; Handbook of the Birds of the World, 2024) are available on request from BirdLife International (http://datazone.birdlife.org/species/requestdis); their licence does not permit redistribution. Survey-effort indicators were derived from eBird/GBIF occurrence records (2024 records: GBIF.org, 2026, https://doi.org/10.15468/dl.vfeeak) and China Bird Report checklists (http://www.birdreport.cn); the raw records remain subject to their providers’ terms, and the province-year effort panel is provided in the project repository. All analysis code (R 4.5.1), the risk set, the derived climate and effort panels and every result table are available at https://github.com/dingchenchen6/bird-newrecord-discovery-dated (Ding, 2026) and will be archived in Zenodo with a DOI upon acceptance; the model equations and all parameter estimates are given in Materials and Methods and Supporting Information.</w:t>
       </w:r>
     </w:p>
     <w:bookmarkEnd w:id="41"/>
@@ -3267,6 +3283,14 @@
       </w:r>
       <w:r>
         <w:t xml:space="preserve">, 4302–4315 (2017). https://doi.org/10.1002/joc.5086</w:t>
+      </w:r>
+    </w:p>
+    <w:p>
+      <w:pPr>
+        <w:pStyle w:val="BodyText"/>
+      </w:pPr>
+      <w:r>
+        <w:t xml:space="preserve">GBIF.org. GBIF occurrence download: eBird Observation Dataset, China, 2024 (27 September 2026). https://doi.org/10.15468/dl.vfeeak (2026).</w:t>
       </w:r>
     </w:p>
     <w:p>
@@ -4349,7 +4373,7 @@
                 <w:rFonts w:ascii="Times New Roman" w:hAnsi="Times New Roman"/>
                 <w:sz w:val="16"/>
               </w:rPr>
-              <w:t xml:space="preserve">181,134</w:t>
+              <w:t xml:space="preserve">180,873</w:t>
             </w:r>
           </w:p>
         </w:tc>
@@ -4385,25 +4409,25 @@
                 <w:rFonts w:ascii="Times New Roman" w:hAnsi="Times New Roman"/>
                 <w:sz w:val="16"/>
               </w:rPr>
-              <w:t xml:space="preserve">1.305</w:t>
-            </w:r>
-          </w:p>
-        </w:tc>
-        <w:tc>
-          <w:tcPr>
-            <w:vAlign w:val="center"/>
-          </w:tcPr>
-          <w:p>
-            <w:pPr>
-              <w:pStyle w:val="Compact"/>
-              <w:spacing w:line="240" w:lineRule="auto" w:after="0"/>
-            </w:pPr>
-            <w:r>
-              <w:rPr>
-                <w:rFonts w:ascii="Times New Roman" w:hAnsi="Times New Roman"/>
-                <w:sz w:val="16"/>
-              </w:rPr>
-              <w:t xml:space="preserve">1.437</w:t>
+              <w:t xml:space="preserve">1.309</w:t>
+            </w:r>
+          </w:p>
+        </w:tc>
+        <w:tc>
+          <w:tcPr>
+            <w:vAlign w:val="center"/>
+          </w:tcPr>
+          <w:p>
+            <w:pPr>
+              <w:pStyle w:val="Compact"/>
+              <w:spacing w:line="240" w:lineRule="auto" w:after="0"/>
+            </w:pPr>
+            <w:r>
+              <w:rPr>
+                <w:rFonts w:ascii="Times New Roman" w:hAnsi="Times New Roman"/>
+                <w:sz w:val="16"/>
+              </w:rPr>
+              <w:t xml:space="preserve">1.440</w:t>
             </w:r>
           </w:p>
         </w:tc>
@@ -4439,7 +4463,7 @@
                 <w:rFonts w:ascii="Times New Roman" w:hAnsi="Times New Roman"/>
                 <w:sz w:val="16"/>
               </w:rPr>
-              <w:t xml:space="preserve">0.859</w:t>
+              <w:t xml:space="preserve">0.852</w:t>
             </w:r>
           </w:p>
         </w:tc>
@@ -4495,7 +4519,7 @@
                 <w:rFonts w:ascii="Times New Roman" w:hAnsi="Times New Roman"/>
                 <w:sz w:val="16"/>
               </w:rPr>
-              <w:t xml:space="preserve">175,686</w:t>
+              <w:t xml:space="preserve">175,425</w:t>
             </w:r>
           </w:p>
         </w:tc>
@@ -4531,25 +4555,25 @@
                 <w:rFonts w:ascii="Times New Roman" w:hAnsi="Times New Roman"/>
                 <w:sz w:val="16"/>
               </w:rPr>
-              <w:t xml:space="preserve">1.267</w:t>
-            </w:r>
-          </w:p>
-        </w:tc>
-        <w:tc>
-          <w:tcPr>
-            <w:vAlign w:val="center"/>
-          </w:tcPr>
-          <w:p>
-            <w:pPr>
-              <w:pStyle w:val="Compact"/>
-              <w:spacing w:line="240" w:lineRule="auto" w:after="0"/>
-            </w:pPr>
-            <w:r>
-              <w:rPr>
-                <w:rFonts w:ascii="Times New Roman" w:hAnsi="Times New Roman"/>
-                <w:sz w:val="16"/>
-              </w:rPr>
-              <w:t xml:space="preserve">1.432</w:t>
+              <w:t xml:space="preserve">1.271</w:t>
+            </w:r>
+          </w:p>
+        </w:tc>
+        <w:tc>
+          <w:tcPr>
+            <w:vAlign w:val="center"/>
+          </w:tcPr>
+          <w:p>
+            <w:pPr>
+              <w:pStyle w:val="Compact"/>
+              <w:spacing w:line="240" w:lineRule="auto" w:after="0"/>
+            </w:pPr>
+            <w:r>
+              <w:rPr>
+                <w:rFonts w:ascii="Times New Roman" w:hAnsi="Times New Roman"/>
+                <w:sz w:val="16"/>
+              </w:rPr>
+              <w:t xml:space="preserve">1.435</w:t>
             </w:r>
           </w:p>
         </w:tc>
@@ -4585,7 +4609,7 @@
                 <w:rFonts w:ascii="Times New Roman" w:hAnsi="Times New Roman"/>
                 <w:sz w:val="16"/>
               </w:rPr>
-              <w:t xml:space="preserve">0.863</w:t>
+              <w:t xml:space="preserve">0.856</w:t>
             </w:r>
           </w:p>
         </w:tc>
@@ -4641,7 +4665,7 @@
                 <w:rFonts w:ascii="Times New Roman" w:hAnsi="Times New Roman"/>
                 <w:sz w:val="16"/>
               </w:rPr>
-              <w:t xml:space="preserve">175,901</w:t>
+              <w:t xml:space="preserve">175,640</w:t>
             </w:r>
           </w:p>
         </w:tc>
@@ -4677,25 +4701,25 @@
                 <w:rFonts w:ascii="Times New Roman" w:hAnsi="Times New Roman"/>
                 <w:sz w:val="16"/>
               </w:rPr>
-              <w:t xml:space="preserve">1.289</w:t>
-            </w:r>
-          </w:p>
-        </w:tc>
-        <w:tc>
-          <w:tcPr>
-            <w:vAlign w:val="center"/>
-          </w:tcPr>
-          <w:p>
-            <w:pPr>
-              <w:pStyle w:val="Compact"/>
-              <w:spacing w:line="240" w:lineRule="auto" w:after="0"/>
-            </w:pPr>
-            <w:r>
-              <w:rPr>
-                <w:rFonts w:ascii="Times New Roman" w:hAnsi="Times New Roman"/>
-                <w:sz w:val="16"/>
-              </w:rPr>
-              <w:t xml:space="preserve">1.432</w:t>
+              <w:t xml:space="preserve">1.300</w:t>
+            </w:r>
+          </w:p>
+        </w:tc>
+        <w:tc>
+          <w:tcPr>
+            <w:vAlign w:val="center"/>
+          </w:tcPr>
+          <w:p>
+            <w:pPr>
+              <w:pStyle w:val="Compact"/>
+              <w:spacing w:line="240" w:lineRule="auto" w:after="0"/>
+            </w:pPr>
+            <w:r>
+              <w:rPr>
+                <w:rFonts w:ascii="Times New Roman" w:hAnsi="Times New Roman"/>
+                <w:sz w:val="16"/>
+              </w:rPr>
+              <w:t xml:space="preserve">1.434</w:t>
             </w:r>
           </w:p>
         </w:tc>
@@ -4731,7 +4755,7 @@
                 <w:rFonts w:ascii="Times New Roman" w:hAnsi="Times New Roman"/>
                 <w:sz w:val="16"/>
               </w:rPr>
-              <w:t xml:space="preserve">0.863</w:t>
+              <w:t xml:space="preserve">0.856</w:t>
             </w:r>
           </w:p>
         </w:tc>
@@ -4787,7 +4811,7 @@
                 <w:rFonts w:ascii="Times New Roman" w:hAnsi="Times New Roman"/>
                 <w:sz w:val="16"/>
               </w:rPr>
-              <w:t xml:space="preserve">175,901</w:t>
+              <w:t xml:space="preserve">175,640</w:t>
             </w:r>
           </w:p>
         </w:tc>
@@ -4823,61 +4847,61 @@
                 <w:rFonts w:ascii="Times New Roman" w:hAnsi="Times New Roman"/>
                 <w:sz w:val="16"/>
               </w:rPr>
-              <w:t xml:space="preserve">1.448</w:t>
-            </w:r>
-          </w:p>
-        </w:tc>
-        <w:tc>
-          <w:tcPr>
-            <w:vAlign w:val="center"/>
-          </w:tcPr>
-          <w:p>
-            <w:pPr>
-              <w:pStyle w:val="Compact"/>
-              <w:spacing w:line="240" w:lineRule="auto" w:after="0"/>
-            </w:pPr>
-            <w:r>
-              <w:rPr>
-                <w:rFonts w:ascii="Times New Roman" w:hAnsi="Times New Roman"/>
-                <w:sz w:val="16"/>
-              </w:rPr>
-              <w:t xml:space="preserve">1.428</w:t>
-            </w:r>
-          </w:p>
-        </w:tc>
-        <w:tc>
-          <w:tcPr>
-            <w:vAlign w:val="center"/>
-          </w:tcPr>
-          <w:p>
-            <w:pPr>
-              <w:pStyle w:val="Compact"/>
-              <w:spacing w:line="240" w:lineRule="auto" w:after="0"/>
-            </w:pPr>
-            <w:r>
-              <w:rPr>
-                <w:rFonts w:ascii="Times New Roman" w:hAnsi="Times New Roman"/>
-                <w:sz w:val="16"/>
-              </w:rPr>
-              <w:t xml:space="preserve">0.962</w:t>
-            </w:r>
-          </w:p>
-        </w:tc>
-        <w:tc>
-          <w:tcPr>
-            <w:vAlign w:val="center"/>
-          </w:tcPr>
-          <w:p>
-            <w:pPr>
-              <w:pStyle w:val="Compact"/>
-              <w:spacing w:line="240" w:lineRule="auto" w:after="0"/>
-            </w:pPr>
-            <w:r>
-              <w:rPr>
-                <w:rFonts w:ascii="Times New Roman" w:hAnsi="Times New Roman"/>
-                <w:sz w:val="16"/>
-              </w:rPr>
-              <w:t xml:space="preserve">0.862</w:t>
+              <w:t xml:space="preserve">1.467</w:t>
+            </w:r>
+          </w:p>
+        </w:tc>
+        <w:tc>
+          <w:tcPr>
+            <w:vAlign w:val="center"/>
+          </w:tcPr>
+          <w:p>
+            <w:pPr>
+              <w:pStyle w:val="Compact"/>
+              <w:spacing w:line="240" w:lineRule="auto" w:after="0"/>
+            </w:pPr>
+            <w:r>
+              <w:rPr>
+                <w:rFonts w:ascii="Times New Roman" w:hAnsi="Times New Roman"/>
+                <w:sz w:val="16"/>
+              </w:rPr>
+              <w:t xml:space="preserve">1.430</w:t>
+            </w:r>
+          </w:p>
+        </w:tc>
+        <w:tc>
+          <w:tcPr>
+            <w:vAlign w:val="center"/>
+          </w:tcPr>
+          <w:p>
+            <w:pPr>
+              <w:pStyle w:val="Compact"/>
+              <w:spacing w:line="240" w:lineRule="auto" w:after="0"/>
+            </w:pPr>
+            <w:r>
+              <w:rPr>
+                <w:rFonts w:ascii="Times New Roman" w:hAnsi="Times New Roman"/>
+                <w:sz w:val="16"/>
+              </w:rPr>
+              <w:t xml:space="preserve">0.961</w:t>
+            </w:r>
+          </w:p>
+        </w:tc>
+        <w:tc>
+          <w:tcPr>
+            <w:vAlign w:val="center"/>
+          </w:tcPr>
+          <w:p>
+            <w:pPr>
+              <w:pStyle w:val="Compact"/>
+              <w:spacing w:line="240" w:lineRule="auto" w:after="0"/>
+            </w:pPr>
+            <w:r>
+              <w:rPr>
+                <w:rFonts w:ascii="Times New Roman" w:hAnsi="Times New Roman"/>
+                <w:sz w:val="16"/>
+              </w:rPr>
+              <w:t xml:space="preserve">0.854</w:t>
             </w:r>
           </w:p>
         </w:tc>
@@ -4933,7 +4957,7 @@
                 <w:rFonts w:ascii="Times New Roman" w:hAnsi="Times New Roman"/>
                 <w:sz w:val="16"/>
               </w:rPr>
-              <w:t xml:space="preserve">175,901</w:t>
+              <w:t xml:space="preserve">175,640</w:t>
             </w:r>
           </w:p>
         </w:tc>
@@ -4971,7 +4995,7 @@
                 <w:bCs/>
                 <w:sz w:val="16"/>
               </w:rPr>
-              <w:t xml:space="preserve">1.404</w:t>
+              <w:t xml:space="preserve">1.429</w:t>
             </w:r>
           </w:p>
         </w:tc>
@@ -4991,7 +5015,7 @@
                 <w:bCs/>
                 <w:sz w:val="16"/>
               </w:rPr>
-              <w:t xml:space="preserve">1.362</w:t>
+              <w:t xml:space="preserve">1.365</w:t>
             </w:r>
           </w:p>
         </w:tc>
@@ -5031,7 +5055,7 @@
                 <w:bCs/>
                 <w:sz w:val="16"/>
               </w:rPr>
-              <w:t xml:space="preserve">0.849</w:t>
+              <w:t xml:space="preserve">0.839</w:t>
             </w:r>
           </w:p>
         </w:tc>
@@ -5068,7 +5092,7 @@
         <w:t xml:space="preserve"> </w:t>
       </w:r>
       <w:r>
-        <w:t xml:space="preserve">= 175,901; 649 events; 392 species; 31 provinces; AIC 8,313.2. Cluster bootstrap: 300 resamples of provinces. Permutation null medians are from the strongest constrained null (N3, events shuffled among the species at risk within each province-year) for the climate terms and the interaction, and from N2 (effort shuffled across years within province) for effort; 199 permutations each. Because these nulls preserve the provincial-annual structure, their medians rather than unity are the correct reference for the corresponding effect sizes.</w:t>
+        <w:t xml:space="preserve">= 175,640; 649 events; 392 species; 31 provinces; AIC 8,308.5. Cluster bootstrap: 300 resamples of provinces. Permutation null medians are from the strongest constrained null (N3, events shuffled among the species at risk within each province-year) for the climate terms and the interaction, and from N2 (effort shuffled across years within province) for effort; 199 permutations each. Because these nulls preserve the provincial-annual structure, their medians rather than unity are the correct reference for the corresponding effect sizes.</w:t>
       </w:r>
     </w:p>
     <w:tbl>
@@ -5272,25 +5296,25 @@
                 <w:rFonts w:ascii="Times New Roman" w:hAnsi="Times New Roman"/>
                 <w:sz w:val="16"/>
               </w:rPr>
-              <w:t xml:space="preserve">1.362</w:t>
-            </w:r>
-          </w:p>
-        </w:tc>
-        <w:tc>
-          <w:tcPr>
-            <w:vAlign w:val="center"/>
-          </w:tcPr>
-          <w:p>
-            <w:pPr>
-              <w:pStyle w:val="Compact"/>
-              <w:spacing w:line="240" w:lineRule="auto" w:after="0"/>
-            </w:pPr>
-            <w:r>
-              <w:rPr>
-                <w:rFonts w:ascii="Times New Roman" w:hAnsi="Times New Roman"/>
-                <w:sz w:val="16"/>
-              </w:rPr>
-              <w:t xml:space="preserve">1.216–1.524</w:t>
+              <w:t xml:space="preserve">1.365</w:t>
+            </w:r>
+          </w:p>
+        </w:tc>
+        <w:tc>
+          <w:tcPr>
+            <w:vAlign w:val="center"/>
+          </w:tcPr>
+          <w:p>
+            <w:pPr>
+              <w:pStyle w:val="Compact"/>
+              <w:spacing w:line="240" w:lineRule="auto" w:after="0"/>
+            </w:pPr>
+            <w:r>
+              <w:rPr>
+                <w:rFonts w:ascii="Times New Roman" w:hAnsi="Times New Roman"/>
+                <w:sz w:val="16"/>
+              </w:rPr>
+              <w:t xml:space="preserve">1.219–1.528</w:t>
             </w:r>
           </w:p>
         </w:tc>
@@ -5326,25 +5350,25 @@
                 <w:rFonts w:ascii="Times New Roman" w:hAnsi="Times New Roman"/>
                 <w:sz w:val="16"/>
               </w:rPr>
-              <w:t xml:space="preserve">1.157</w:t>
-            </w:r>
-          </w:p>
-        </w:tc>
-        <w:tc>
-          <w:tcPr>
-            <w:vAlign w:val="center"/>
-          </w:tcPr>
-          <w:p>
-            <w:pPr>
-              <w:pStyle w:val="Compact"/>
-              <w:spacing w:line="240" w:lineRule="auto" w:after="0"/>
-            </w:pPr>
-            <w:r>
-              <w:rPr>
-                <w:rFonts w:ascii="Times New Roman" w:hAnsi="Times New Roman"/>
-                <w:sz w:val="16"/>
-              </w:rPr>
-              <w:t xml:space="preserve">8.3 × 10⁻⁸</w:t>
+              <w:t xml:space="preserve">1.161</w:t>
+            </w:r>
+          </w:p>
+        </w:tc>
+        <w:tc>
+          <w:tcPr>
+            <w:vAlign w:val="center"/>
+          </w:tcPr>
+          <w:p>
+            <w:pPr>
+              <w:pStyle w:val="Compact"/>
+              <w:spacing w:line="240" w:lineRule="auto" w:after="0"/>
+            </w:pPr>
+            <w:r>
+              <w:rPr>
+                <w:rFonts w:ascii="Times New Roman" w:hAnsi="Times New Roman"/>
+                <w:sz w:val="16"/>
+              </w:rPr>
+              <w:t xml:space="preserve">7.2 × 10⁻⁸</w:t>
             </w:r>
           </w:p>
         </w:tc>
@@ -5382,79 +5406,79 @@
                 <w:rFonts w:ascii="Times New Roman" w:hAnsi="Times New Roman"/>
                 <w:sz w:val="16"/>
               </w:rPr>
-              <w:t xml:space="preserve">1.404</w:t>
-            </w:r>
-          </w:p>
-        </w:tc>
-        <w:tc>
-          <w:tcPr>
-            <w:vAlign w:val="center"/>
-          </w:tcPr>
-          <w:p>
-            <w:pPr>
-              <w:pStyle w:val="Compact"/>
-              <w:spacing w:line="240" w:lineRule="auto" w:after="0"/>
-            </w:pPr>
-            <w:r>
-              <w:rPr>
-                <w:rFonts w:ascii="Times New Roman" w:hAnsi="Times New Roman"/>
-                <w:sz w:val="16"/>
-              </w:rPr>
-              <w:t xml:space="preserve">1.245–1.583</w:t>
-            </w:r>
-          </w:p>
-        </w:tc>
-        <w:tc>
-          <w:tcPr>
-            <w:vAlign w:val="center"/>
-          </w:tcPr>
-          <w:p>
-            <w:pPr>
-              <w:pStyle w:val="Compact"/>
-              <w:spacing w:line="240" w:lineRule="auto" w:after="0"/>
-            </w:pPr>
-            <w:r>
-              <w:rPr>
-                <w:rFonts w:ascii="Times New Roman" w:hAnsi="Times New Roman"/>
-                <w:sz w:val="16"/>
-              </w:rPr>
-              <w:t xml:space="preserve">1.21–1.76</w:t>
-            </w:r>
-          </w:p>
-        </w:tc>
-        <w:tc>
-          <w:tcPr>
-            <w:vAlign w:val="center"/>
-          </w:tcPr>
-          <w:p>
-            <w:pPr>
-              <w:pStyle w:val="Compact"/>
-              <w:spacing w:line="240" w:lineRule="auto" w:after="0"/>
-            </w:pPr>
-            <w:r>
-              <w:rPr>
-                <w:rFonts w:ascii="Times New Roman" w:hAnsi="Times New Roman"/>
-                <w:sz w:val="16"/>
-              </w:rPr>
-              <w:t xml:space="preserve">0.980</w:t>
-            </w:r>
-          </w:p>
-        </w:tc>
-        <w:tc>
-          <w:tcPr>
-            <w:vAlign w:val="center"/>
-          </w:tcPr>
-          <w:p>
-            <w:pPr>
-              <w:pStyle w:val="Compact"/>
-              <w:spacing w:line="240" w:lineRule="auto" w:after="0"/>
-            </w:pPr>
-            <w:r>
-              <w:rPr>
-                <w:rFonts w:ascii="Times New Roman" w:hAnsi="Times New Roman"/>
-                <w:sz w:val="16"/>
-              </w:rPr>
-              <w:t xml:space="preserve">2.9 × 10⁻⁸</w:t>
+              <w:t xml:space="preserve">1.429</w:t>
+            </w:r>
+          </w:p>
+        </w:tc>
+        <w:tc>
+          <w:tcPr>
+            <w:vAlign w:val="center"/>
+          </w:tcPr>
+          <w:p>
+            <w:pPr>
+              <w:pStyle w:val="Compact"/>
+              <w:spacing w:line="240" w:lineRule="auto" w:after="0"/>
+            </w:pPr>
+            <w:r>
+              <w:rPr>
+                <w:rFonts w:ascii="Times New Roman" w:hAnsi="Times New Roman"/>
+                <w:sz w:val="16"/>
+              </w:rPr>
+              <w:t xml:space="preserve">1.268–1.611</w:t>
+            </w:r>
+          </w:p>
+        </w:tc>
+        <w:tc>
+          <w:tcPr>
+            <w:vAlign w:val="center"/>
+          </w:tcPr>
+          <w:p>
+            <w:pPr>
+              <w:pStyle w:val="Compact"/>
+              <w:spacing w:line="240" w:lineRule="auto" w:after="0"/>
+            </w:pPr>
+            <w:r>
+              <w:rPr>
+                <w:rFonts w:ascii="Times New Roman" w:hAnsi="Times New Roman"/>
+                <w:sz w:val="16"/>
+              </w:rPr>
+              <w:t xml:space="preserve">1.24–1.78</w:t>
+            </w:r>
+          </w:p>
+        </w:tc>
+        <w:tc>
+          <w:tcPr>
+            <w:vAlign w:val="center"/>
+          </w:tcPr>
+          <w:p>
+            <w:pPr>
+              <w:pStyle w:val="Compact"/>
+              <w:spacing w:line="240" w:lineRule="auto" w:after="0"/>
+            </w:pPr>
+            <w:r>
+              <w:rPr>
+                <w:rFonts w:ascii="Times New Roman" w:hAnsi="Times New Roman"/>
+                <w:sz w:val="16"/>
+              </w:rPr>
+              <w:t xml:space="preserve">0.979</w:t>
+            </w:r>
+          </w:p>
+        </w:tc>
+        <w:tc>
+          <w:tcPr>
+            <w:vAlign w:val="center"/>
+          </w:tcPr>
+          <w:p>
+            <w:pPr>
+              <w:pStyle w:val="Compact"/>
+              <w:spacing w:line="240" w:lineRule="auto" w:after="0"/>
+            </w:pPr>
+            <w:r>
+              <w:rPr>
+                <w:rFonts w:ascii="Times New Roman" w:hAnsi="Times New Roman"/>
+                <w:sz w:val="16"/>
+              </w:rPr>
+              <w:t xml:space="preserve">4.9 × 10⁻⁹</w:t>
             </w:r>
           </w:p>
         </w:tc>
@@ -5510,7 +5534,7 @@
                 <w:rFonts w:ascii="Times New Roman" w:hAnsi="Times New Roman"/>
                 <w:sz w:val="16"/>
               </w:rPr>
-              <w:t xml:space="preserve">0.909–1.090</w:t>
+              <w:t xml:space="preserve">0.908–1.089</w:t>
             </w:r>
           </w:p>
         </w:tc>
@@ -5546,25 +5570,25 @@
                 <w:rFonts w:ascii="Times New Roman" w:hAnsi="Times New Roman"/>
                 <w:sz w:val="16"/>
               </w:rPr>
-              <w:t xml:space="preserve">0.955</w:t>
-            </w:r>
-          </w:p>
-        </w:tc>
-        <w:tc>
-          <w:tcPr>
-            <w:vAlign w:val="center"/>
-          </w:tcPr>
-          <w:p>
-            <w:pPr>
-              <w:pStyle w:val="Compact"/>
-              <w:spacing w:line="240" w:lineRule="auto" w:after="0"/>
-            </w:pPr>
-            <w:r>
-              <w:rPr>
-                <w:rFonts w:ascii="Times New Roman" w:hAnsi="Times New Roman"/>
-                <w:sz w:val="16"/>
-              </w:rPr>
-              <w:t xml:space="preserve">0.92</w:t>
+              <w:t xml:space="preserve">0.965</w:t>
+            </w:r>
+          </w:p>
+        </w:tc>
+        <w:tc>
+          <w:tcPr>
+            <w:vAlign w:val="center"/>
+          </w:tcPr>
+          <w:p>
+            <w:pPr>
+              <w:pStyle w:val="Compact"/>
+              <w:spacing w:line="240" w:lineRule="auto" w:after="0"/>
+            </w:pPr>
+            <w:r>
+              <w:rPr>
+                <w:rFonts w:ascii="Times New Roman" w:hAnsi="Times New Roman"/>
+                <w:sz w:val="16"/>
+              </w:rPr>
+              <w:t xml:space="preserve">0.91</w:t>
             </w:r>
           </w:p>
         </w:tc>
@@ -5602,79 +5626,79 @@
                 <w:rFonts w:ascii="Times New Roman" w:hAnsi="Times New Roman"/>
                 <w:sz w:val="16"/>
               </w:rPr>
-              <w:t xml:space="preserve">0.849</w:t>
-            </w:r>
-          </w:p>
-        </w:tc>
-        <w:tc>
-          <w:tcPr>
-            <w:vAlign w:val="center"/>
-          </w:tcPr>
-          <w:p>
-            <w:pPr>
-              <w:pStyle w:val="Compact"/>
-              <w:spacing w:line="240" w:lineRule="auto" w:after="0"/>
-            </w:pPr>
-            <w:r>
-              <w:rPr>
-                <w:rFonts w:ascii="Times New Roman" w:hAnsi="Times New Roman"/>
-                <w:sz w:val="16"/>
-              </w:rPr>
-              <w:t xml:space="preserve">0.761–0.948</w:t>
-            </w:r>
-          </w:p>
-        </w:tc>
-        <w:tc>
-          <w:tcPr>
-            <w:vAlign w:val="center"/>
-          </w:tcPr>
-          <w:p>
-            <w:pPr>
-              <w:pStyle w:val="Compact"/>
-              <w:spacing w:line="240" w:lineRule="auto" w:after="0"/>
-            </w:pPr>
-            <w:r>
-              <w:rPr>
-                <w:rFonts w:ascii="Times New Roman" w:hAnsi="Times New Roman"/>
-                <w:sz w:val="16"/>
-              </w:rPr>
-              <w:t xml:space="preserve">0.74–0.99</w:t>
-            </w:r>
-          </w:p>
-        </w:tc>
-        <w:tc>
-          <w:tcPr>
-            <w:vAlign w:val="center"/>
-          </w:tcPr>
-          <w:p>
-            <w:pPr>
-              <w:pStyle w:val="Compact"/>
-              <w:spacing w:line="240" w:lineRule="auto" w:after="0"/>
-            </w:pPr>
-            <w:r>
-              <w:rPr>
-                <w:rFonts w:ascii="Times New Roman" w:hAnsi="Times New Roman"/>
-                <w:sz w:val="16"/>
-              </w:rPr>
-              <w:t xml:space="preserve">0.955</w:t>
-            </w:r>
-          </w:p>
-        </w:tc>
-        <w:tc>
-          <w:tcPr>
-            <w:vAlign w:val="center"/>
-          </w:tcPr>
-          <w:p>
-            <w:pPr>
-              <w:pStyle w:val="Compact"/>
-              <w:spacing w:line="240" w:lineRule="auto" w:after="0"/>
-            </w:pPr>
-            <w:r>
-              <w:rPr>
-                <w:rFonts w:ascii="Times New Roman" w:hAnsi="Times New Roman"/>
-                <w:sz w:val="16"/>
-              </w:rPr>
-              <w:t xml:space="preserve">3.7 × 10⁻³</w:t>
+              <w:t xml:space="preserve">0.839</w:t>
+            </w:r>
+          </w:p>
+        </w:tc>
+        <w:tc>
+          <w:tcPr>
+            <w:vAlign w:val="center"/>
+          </w:tcPr>
+          <w:p>
+            <w:pPr>
+              <w:pStyle w:val="Compact"/>
+              <w:spacing w:line="240" w:lineRule="auto" w:after="0"/>
+            </w:pPr>
+            <w:r>
+              <w:rPr>
+                <w:rFonts w:ascii="Times New Roman" w:hAnsi="Times New Roman"/>
+                <w:sz w:val="16"/>
+              </w:rPr>
+              <w:t xml:space="preserve">0.752–0.936</w:t>
+            </w:r>
+          </w:p>
+        </w:tc>
+        <w:tc>
+          <w:tcPr>
+            <w:vAlign w:val="center"/>
+          </w:tcPr>
+          <w:p>
+            <w:pPr>
+              <w:pStyle w:val="Compact"/>
+              <w:spacing w:line="240" w:lineRule="auto" w:after="0"/>
+            </w:pPr>
+            <w:r>
+              <w:rPr>
+                <w:rFonts w:ascii="Times New Roman" w:hAnsi="Times New Roman"/>
+                <w:sz w:val="16"/>
+              </w:rPr>
+              <w:t xml:space="preserve">0.73–0.99</w:t>
+            </w:r>
+          </w:p>
+        </w:tc>
+        <w:tc>
+          <w:tcPr>
+            <w:vAlign w:val="center"/>
+          </w:tcPr>
+          <w:p>
+            <w:pPr>
+              <w:pStyle w:val="Compact"/>
+              <w:spacing w:line="240" w:lineRule="auto" w:after="0"/>
+            </w:pPr>
+            <w:r>
+              <w:rPr>
+                <w:rFonts w:ascii="Times New Roman" w:hAnsi="Times New Roman"/>
+                <w:sz w:val="16"/>
+              </w:rPr>
+              <w:t xml:space="preserve">0.960</w:t>
+            </w:r>
+          </w:p>
+        </w:tc>
+        <w:tc>
+          <w:tcPr>
+            <w:vAlign w:val="center"/>
+          </w:tcPr>
+          <w:p>
+            <w:pPr>
+              <w:pStyle w:val="Compact"/>
+              <w:spacing w:line="240" w:lineRule="auto" w:after="0"/>
+            </w:pPr>
+            <w:r>
+              <w:rPr>
+                <w:rFonts w:ascii="Times New Roman" w:hAnsi="Times New Roman"/>
+                <w:sz w:val="16"/>
+              </w:rPr>
+              <w:t xml:space="preserve">1.7 × 10⁻³</w:t>
             </w:r>
           </w:p>
         </w:tc>
@@ -5712,7 +5736,7 @@
                 <w:rFonts w:ascii="Times New Roman" w:hAnsi="Times New Roman"/>
                 <w:sz w:val="16"/>
               </w:rPr>
-              <w:t xml:space="preserve">0.405</w:t>
+              <w:t xml:space="preserve">0.404</w:t>
             </w:r>
           </w:p>
         </w:tc>
@@ -5794,7 +5818,7 @@
                 <w:rFonts w:ascii="Times New Roman" w:hAnsi="Times New Roman"/>
                 <w:sz w:val="16"/>
               </w:rPr>
-              <w:t xml:space="preserve">0.326</w:t>
+              <w:t xml:space="preserve">0.332</w:t>
             </w:r>
           </w:p>
         </w:tc>
@@ -5876,7 +5900,7 @@
                 <w:rFonts w:ascii="Times New Roman" w:hAnsi="Times New Roman"/>
                 <w:sz w:val="16"/>
               </w:rPr>
-              <w:t xml:space="preserve">0.804</w:t>
+              <w:t xml:space="preserve">0.798</w:t>
             </w:r>
           </w:p>
         </w:tc>
@@ -6267,97 +6291,97 @@
                 <w:rFonts w:ascii="Times New Roman" w:hAnsi="Times New Roman"/>
                 <w:sz w:val="16"/>
               </w:rPr>
-              <w:t xml:space="preserve">163.1</w:t>
-            </w:r>
-          </w:p>
-        </w:tc>
-        <w:tc>
-          <w:tcPr>
-            <w:vAlign w:val="center"/>
-          </w:tcPr>
-          <w:p>
-            <w:pPr>
-              <w:pStyle w:val="Compact"/>
-              <w:spacing w:line="240" w:lineRule="auto" w:after="0"/>
-            </w:pPr>
-            <w:r>
-              <w:rPr>
-                <w:rFonts w:ascii="Times New Roman" w:hAnsi="Times New Roman"/>
-                <w:sz w:val="16"/>
-              </w:rPr>
-              <w:t xml:space="preserve">0.0142</w:t>
-            </w:r>
-          </w:p>
-        </w:tc>
-        <w:tc>
-          <w:tcPr>
-            <w:vAlign w:val="center"/>
-          </w:tcPr>
-          <w:p>
-            <w:pPr>
-              <w:pStyle w:val="Compact"/>
-              <w:spacing w:line="240" w:lineRule="auto" w:after="0"/>
-            </w:pPr>
-            <w:r>
-              <w:rPr>
-                <w:rFonts w:ascii="Times New Roman" w:hAnsi="Times New Roman"/>
-                <w:sz w:val="16"/>
-              </w:rPr>
-              <w:t xml:space="preserve">0.108</w:t>
-            </w:r>
-          </w:p>
-        </w:tc>
-        <w:tc>
-          <w:tcPr>
-            <w:vAlign w:val="center"/>
-          </w:tcPr>
-          <w:p>
-            <w:pPr>
-              <w:pStyle w:val="Compact"/>
-              <w:spacing w:line="240" w:lineRule="auto" w:after="0"/>
-            </w:pPr>
-            <w:r>
-              <w:rPr>
-                <w:rFonts w:ascii="Times New Roman" w:hAnsi="Times New Roman"/>
-                <w:sz w:val="16"/>
-              </w:rPr>
-              <w:t xml:space="preserve">0.183</w:t>
-            </w:r>
-          </w:p>
-        </w:tc>
-        <w:tc>
-          <w:tcPr>
-            <w:vAlign w:val="center"/>
-          </w:tcPr>
-          <w:p>
-            <w:pPr>
-              <w:pStyle w:val="Compact"/>
-              <w:spacing w:line="240" w:lineRule="auto" w:after="0"/>
-            </w:pPr>
-            <w:r>
-              <w:rPr>
-                <w:rFonts w:ascii="Times New Roman" w:hAnsi="Times New Roman"/>
-                <w:sz w:val="16"/>
-              </w:rPr>
-              <w:t xml:space="preserve">0.613</w:t>
-            </w:r>
-          </w:p>
-        </w:tc>
-        <w:tc>
-          <w:tcPr>
-            <w:vAlign w:val="center"/>
-          </w:tcPr>
-          <w:p>
-            <w:pPr>
-              <w:pStyle w:val="Compact"/>
-              <w:spacing w:line="240" w:lineRule="auto" w:after="0"/>
-            </w:pPr>
-            <w:r>
-              <w:rPr>
-                <w:rFonts w:ascii="Times New Roman" w:hAnsi="Times New Roman"/>
-                <w:sz w:val="16"/>
-              </w:rPr>
-              <w:t xml:space="preserve">0.687</w:t>
+              <w:t xml:space="preserve">160.6</w:t>
+            </w:r>
+          </w:p>
+        </w:tc>
+        <w:tc>
+          <w:tcPr>
+            <w:vAlign w:val="center"/>
+          </w:tcPr>
+          <w:p>
+            <w:pPr>
+              <w:pStyle w:val="Compact"/>
+              <w:spacing w:line="240" w:lineRule="auto" w:after="0"/>
+            </w:pPr>
+            <w:r>
+              <w:rPr>
+                <w:rFonts w:ascii="Times New Roman" w:hAnsi="Times New Roman"/>
+                <w:sz w:val="16"/>
+              </w:rPr>
+              <w:t xml:space="preserve">0.0147</w:t>
+            </w:r>
+          </w:p>
+        </w:tc>
+        <w:tc>
+          <w:tcPr>
+            <w:vAlign w:val="center"/>
+          </w:tcPr>
+          <w:p>
+            <w:pPr>
+              <w:pStyle w:val="Compact"/>
+              <w:spacing w:line="240" w:lineRule="auto" w:after="0"/>
+            </w:pPr>
+            <w:r>
+              <w:rPr>
+                <w:rFonts w:ascii="Times New Roman" w:hAnsi="Times New Roman"/>
+                <w:sz w:val="16"/>
+              </w:rPr>
+              <w:t xml:space="preserve">0.113</w:t>
+            </w:r>
+          </w:p>
+        </w:tc>
+        <w:tc>
+          <w:tcPr>
+            <w:vAlign w:val="center"/>
+          </w:tcPr>
+          <w:p>
+            <w:pPr>
+              <w:pStyle w:val="Compact"/>
+              <w:spacing w:line="240" w:lineRule="auto" w:after="0"/>
+            </w:pPr>
+            <w:r>
+              <w:rPr>
+                <w:rFonts w:ascii="Times New Roman" w:hAnsi="Times New Roman"/>
+                <w:sz w:val="16"/>
+              </w:rPr>
+              <w:t xml:space="preserve">0.187</w:t>
+            </w:r>
+          </w:p>
+        </w:tc>
+        <w:tc>
+          <w:tcPr>
+            <w:vAlign w:val="center"/>
+          </w:tcPr>
+          <w:p>
+            <w:pPr>
+              <w:pStyle w:val="Compact"/>
+              <w:spacing w:line="240" w:lineRule="auto" w:after="0"/>
+            </w:pPr>
+            <w:r>
+              <w:rPr>
+                <w:rFonts w:ascii="Times New Roman" w:hAnsi="Times New Roman"/>
+                <w:sz w:val="16"/>
+              </w:rPr>
+              <w:t xml:space="preserve">0.614</w:t>
+            </w:r>
+          </w:p>
+        </w:tc>
+        <w:tc>
+          <w:tcPr>
+            <w:vAlign w:val="center"/>
+          </w:tcPr>
+          <w:p>
+            <w:pPr>
+              <w:pStyle w:val="Compact"/>
+              <w:spacing w:line="240" w:lineRule="auto" w:after="0"/>
+            </w:pPr>
+            <w:r>
+              <w:rPr>
+                <w:rFonts w:ascii="Times New Roman" w:hAnsi="Times New Roman"/>
+                <w:sz w:val="16"/>
+              </w:rPr>
+              <w:t xml:space="preserve">0.688</w:t>
             </w:r>
           </w:p>
         </w:tc>
@@ -6413,97 +6437,97 @@
                 <w:rFonts w:ascii="Times New Roman" w:hAnsi="Times New Roman"/>
                 <w:sz w:val="16"/>
               </w:rPr>
-              <w:t xml:space="preserve">98.7</w:t>
-            </w:r>
-          </w:p>
-        </w:tc>
-        <w:tc>
-          <w:tcPr>
-            <w:vAlign w:val="center"/>
-          </w:tcPr>
-          <w:p>
-            <w:pPr>
-              <w:pStyle w:val="Compact"/>
-              <w:spacing w:line="240" w:lineRule="auto" w:after="0"/>
-            </w:pPr>
-            <w:r>
-              <w:rPr>
-                <w:rFonts w:ascii="Times New Roman" w:hAnsi="Times New Roman"/>
-                <w:sz w:val="16"/>
-              </w:rPr>
-              <w:t xml:space="preserve">0.0220</w:t>
-            </w:r>
-          </w:p>
-        </w:tc>
-        <w:tc>
-          <w:tcPr>
-            <w:vAlign w:val="center"/>
-          </w:tcPr>
-          <w:p>
-            <w:pPr>
-              <w:pStyle w:val="Compact"/>
-              <w:spacing w:line="240" w:lineRule="auto" w:after="0"/>
-            </w:pPr>
-            <w:r>
-              <w:rPr>
-                <w:rFonts w:ascii="Times New Roman" w:hAnsi="Times New Roman"/>
-                <w:sz w:val="16"/>
-              </w:rPr>
-              <w:t xml:space="preserve">0.124</w:t>
-            </w:r>
-          </w:p>
-        </w:tc>
-        <w:tc>
-          <w:tcPr>
-            <w:vAlign w:val="center"/>
-          </w:tcPr>
-          <w:p>
-            <w:pPr>
-              <w:pStyle w:val="Compact"/>
-              <w:spacing w:line="240" w:lineRule="auto" w:after="0"/>
-            </w:pPr>
-            <w:r>
-              <w:rPr>
-                <w:rFonts w:ascii="Times New Roman" w:hAnsi="Times New Roman"/>
-                <w:sz w:val="16"/>
-              </w:rPr>
-              <w:t xml:space="preserve">0.274</w:t>
-            </w:r>
-          </w:p>
-        </w:tc>
-        <w:tc>
-          <w:tcPr>
-            <w:vAlign w:val="center"/>
-          </w:tcPr>
-          <w:p>
-            <w:pPr>
-              <w:pStyle w:val="Compact"/>
-              <w:spacing w:line="240" w:lineRule="auto" w:after="0"/>
-            </w:pPr>
-            <w:r>
-              <w:rPr>
-                <w:rFonts w:ascii="Times New Roman" w:hAnsi="Times New Roman"/>
-                <w:sz w:val="16"/>
-              </w:rPr>
-              <w:t xml:space="preserve">0.612</w:t>
-            </w:r>
-          </w:p>
-        </w:tc>
-        <w:tc>
-          <w:tcPr>
-            <w:vAlign w:val="center"/>
-          </w:tcPr>
-          <w:p>
-            <w:pPr>
-              <w:pStyle w:val="Compact"/>
-              <w:spacing w:line="240" w:lineRule="auto" w:after="0"/>
-            </w:pPr>
-            <w:r>
-              <w:rPr>
-                <w:rFonts w:ascii="Times New Roman" w:hAnsi="Times New Roman"/>
-                <w:sz w:val="16"/>
-              </w:rPr>
-              <w:t xml:space="preserve">0.721</w:t>
+              <w:t xml:space="preserve">95.5</w:t>
+            </w:r>
+          </w:p>
+        </w:tc>
+        <w:tc>
+          <w:tcPr>
+            <w:vAlign w:val="center"/>
+          </w:tcPr>
+          <w:p>
+            <w:pPr>
+              <w:pStyle w:val="Compact"/>
+              <w:spacing w:line="240" w:lineRule="auto" w:after="0"/>
+            </w:pPr>
+            <w:r>
+              <w:rPr>
+                <w:rFonts w:ascii="Times New Roman" w:hAnsi="Times New Roman"/>
+                <w:sz w:val="16"/>
+              </w:rPr>
+              <w:t xml:space="preserve">0.0225</w:t>
+            </w:r>
+          </w:p>
+        </w:tc>
+        <w:tc>
+          <w:tcPr>
+            <w:vAlign w:val="center"/>
+          </w:tcPr>
+          <w:p>
+            <w:pPr>
+              <w:pStyle w:val="Compact"/>
+              <w:spacing w:line="240" w:lineRule="auto" w:after="0"/>
+            </w:pPr>
+            <w:r>
+              <w:rPr>
+                <w:rFonts w:ascii="Times New Roman" w:hAnsi="Times New Roman"/>
+                <w:sz w:val="16"/>
+              </w:rPr>
+              <w:t xml:space="preserve">0.129</w:t>
+            </w:r>
+          </w:p>
+        </w:tc>
+        <w:tc>
+          <w:tcPr>
+            <w:vAlign w:val="center"/>
+          </w:tcPr>
+          <w:p>
+            <w:pPr>
+              <w:pStyle w:val="Compact"/>
+              <w:spacing w:line="240" w:lineRule="auto" w:after="0"/>
+            </w:pPr>
+            <w:r>
+              <w:rPr>
+                <w:rFonts w:ascii="Times New Roman" w:hAnsi="Times New Roman"/>
+                <w:sz w:val="16"/>
+              </w:rPr>
+              <w:t xml:space="preserve">0.279</w:t>
+            </w:r>
+          </w:p>
+        </w:tc>
+        <w:tc>
+          <w:tcPr>
+            <w:vAlign w:val="center"/>
+          </w:tcPr>
+          <w:p>
+            <w:pPr>
+              <w:pStyle w:val="Compact"/>
+              <w:spacing w:line="240" w:lineRule="auto" w:after="0"/>
+            </w:pPr>
+            <w:r>
+              <w:rPr>
+                <w:rFonts w:ascii="Times New Roman" w:hAnsi="Times New Roman"/>
+                <w:sz w:val="16"/>
+              </w:rPr>
+              <w:t xml:space="preserve">0.613</w:t>
+            </w:r>
+          </w:p>
+        </w:tc>
+        <w:tc>
+          <w:tcPr>
+            <w:vAlign w:val="center"/>
+          </w:tcPr>
+          <w:p>
+            <w:pPr>
+              <w:pStyle w:val="Compact"/>
+              <w:spacing w:line="240" w:lineRule="auto" w:after="0"/>
+            </w:pPr>
+            <w:r>
+              <w:rPr>
+                <w:rFonts w:ascii="Times New Roman" w:hAnsi="Times New Roman"/>
+                <w:sz w:val="16"/>
+              </w:rPr>
+              <w:t xml:space="preserve">0.722</w:t>
             </w:r>
           </w:p>
         </w:tc>
@@ -6559,79 +6583,79 @@
                 <w:rFonts w:ascii="Times New Roman" w:hAnsi="Times New Roman"/>
                 <w:sz w:val="16"/>
               </w:rPr>
-              <w:t xml:space="preserve">74.8</w:t>
-            </w:r>
-          </w:p>
-        </w:tc>
-        <w:tc>
-          <w:tcPr>
-            <w:vAlign w:val="center"/>
-          </w:tcPr>
-          <w:p>
-            <w:pPr>
-              <w:pStyle w:val="Compact"/>
-              <w:spacing w:line="240" w:lineRule="auto" w:after="0"/>
-            </w:pPr>
-            <w:r>
-              <w:rPr>
-                <w:rFonts w:ascii="Times New Roman" w:hAnsi="Times New Roman"/>
-                <w:sz w:val="16"/>
-              </w:rPr>
-              <w:t xml:space="preserve">0.0250</w:t>
-            </w:r>
-          </w:p>
-        </w:tc>
-        <w:tc>
-          <w:tcPr>
-            <w:vAlign w:val="center"/>
-          </w:tcPr>
-          <w:p>
-            <w:pPr>
-              <w:pStyle w:val="Compact"/>
-              <w:spacing w:line="240" w:lineRule="auto" w:after="0"/>
-            </w:pPr>
-            <w:r>
-              <w:rPr>
-                <w:rFonts w:ascii="Times New Roman" w:hAnsi="Times New Roman"/>
-                <w:sz w:val="16"/>
-              </w:rPr>
-              <w:t xml:space="preserve">0.069</w:t>
-            </w:r>
-          </w:p>
-        </w:tc>
-        <w:tc>
-          <w:tcPr>
-            <w:vAlign w:val="center"/>
-          </w:tcPr>
-          <w:p>
-            <w:pPr>
-              <w:pStyle w:val="Compact"/>
-              <w:spacing w:line="240" w:lineRule="auto" w:after="0"/>
-            </w:pPr>
-            <w:r>
-              <w:rPr>
-                <w:rFonts w:ascii="Times New Roman" w:hAnsi="Times New Roman"/>
-                <w:sz w:val="16"/>
-              </w:rPr>
-              <w:t xml:space="preserve">0.277</w:t>
-            </w:r>
-          </w:p>
-        </w:tc>
-        <w:tc>
-          <w:tcPr>
-            <w:vAlign w:val="center"/>
-          </w:tcPr>
-          <w:p>
-            <w:pPr>
-              <w:pStyle w:val="Compact"/>
-              <w:spacing w:line="240" w:lineRule="auto" w:after="0"/>
-            </w:pPr>
-            <w:r>
-              <w:rPr>
-                <w:rFonts w:ascii="Times New Roman" w:hAnsi="Times New Roman"/>
-                <w:sz w:val="16"/>
-              </w:rPr>
-              <w:t xml:space="preserve">0.607</w:t>
+              <w:t xml:space="preserve">73.1</w:t>
+            </w:r>
+          </w:p>
+        </w:tc>
+        <w:tc>
+          <w:tcPr>
+            <w:vAlign w:val="center"/>
+          </w:tcPr>
+          <w:p>
+            <w:pPr>
+              <w:pStyle w:val="Compact"/>
+              <w:spacing w:line="240" w:lineRule="auto" w:after="0"/>
+            </w:pPr>
+            <w:r>
+              <w:rPr>
+                <w:rFonts w:ascii="Times New Roman" w:hAnsi="Times New Roman"/>
+                <w:sz w:val="16"/>
+              </w:rPr>
+              <w:t xml:space="preserve">0.0254</w:t>
+            </w:r>
+          </w:p>
+        </w:tc>
+        <w:tc>
+          <w:tcPr>
+            <w:vAlign w:val="center"/>
+          </w:tcPr>
+          <w:p>
+            <w:pPr>
+              <w:pStyle w:val="Compact"/>
+              <w:spacing w:line="240" w:lineRule="auto" w:after="0"/>
+            </w:pPr>
+            <w:r>
+              <w:rPr>
+                <w:rFonts w:ascii="Times New Roman" w:hAnsi="Times New Roman"/>
+                <w:sz w:val="16"/>
+              </w:rPr>
+              <w:t xml:space="preserve">0.085</w:t>
+            </w:r>
+          </w:p>
+        </w:tc>
+        <w:tc>
+          <w:tcPr>
+            <w:vAlign w:val="center"/>
+          </w:tcPr>
+          <w:p>
+            <w:pPr>
+              <w:pStyle w:val="Compact"/>
+              <w:spacing w:line="240" w:lineRule="auto" w:after="0"/>
+            </w:pPr>
+            <w:r>
+              <w:rPr>
+                <w:rFonts w:ascii="Times New Roman" w:hAnsi="Times New Roman"/>
+                <w:sz w:val="16"/>
+              </w:rPr>
+              <w:t xml:space="preserve">0.282</w:t>
+            </w:r>
+          </w:p>
+        </w:tc>
+        <w:tc>
+          <w:tcPr>
+            <w:vAlign w:val="center"/>
+          </w:tcPr>
+          <w:p>
+            <w:pPr>
+              <w:pStyle w:val="Compact"/>
+              <w:spacing w:line="240" w:lineRule="auto" w:after="0"/>
+            </w:pPr>
+            <w:r>
+              <w:rPr>
+                <w:rFonts w:ascii="Times New Roman" w:hAnsi="Times New Roman"/>
+                <w:sz w:val="16"/>
+              </w:rPr>
+              <w:t xml:space="preserve">0.613</w:t>
             </w:r>
           </w:p>
         </w:tc>
@@ -6667,7 +6691,7 @@
                 <w:rFonts w:ascii="Times New Roman" w:hAnsi="Times New Roman"/>
                 <w:sz w:val="16"/>
               </w:rPr>
-              <w:t xml:space="preserve">0.224</w:t>
+              <w:t xml:space="preserve">0.216</w:t>
             </w:r>
           </w:p>
         </w:tc>
@@ -6709,7 +6733,7 @@
                 <w:bCs/>
                 <w:sz w:val="16"/>
               </w:rPr>
-              <w:t xml:space="preserve">5.25</w:t>
+              <w:t xml:space="preserve">3.32</w:t>
             </w:r>
           </w:p>
         </w:tc>
@@ -6729,7 +6753,7 @@
                 <w:bCs/>
                 <w:sz w:val="16"/>
               </w:rPr>
-              <w:t xml:space="preserve">0.0331</w:t>
+              <w:t xml:space="preserve">0.0335</w:t>
             </w:r>
           </w:p>
         </w:tc>
@@ -6749,7 +6773,7 @@
                 <w:bCs/>
                 <w:sz w:val="16"/>
               </w:rPr>
-              <w:t xml:space="preserve">0.082</w:t>
+              <w:t xml:space="preserve">0.088</w:t>
             </w:r>
           </w:p>
         </w:tc>
@@ -6769,7 +6793,7 @@
                 <w:bCs/>
                 <w:sz w:val="16"/>
               </w:rPr>
-              <w:t xml:space="preserve">0.411</w:t>
+              <w:t xml:space="preserve">0.413</w:t>
             </w:r>
           </w:p>
         </w:tc>
@@ -6809,7 +6833,7 @@
                 <w:bCs/>
                 <w:sz w:val="16"/>
               </w:rPr>
-              <w:t xml:space="preserve">0.854</w:t>
+              <w:t xml:space="preserve">0.853</w:t>
             </w:r>
           </w:p>
         </w:tc>
@@ -6829,7 +6853,7 @@
                 <w:bCs/>
                 <w:sz w:val="16"/>
               </w:rPr>
-              <w:t xml:space="preserve">0.358</w:t>
+              <w:t xml:space="preserve">0.356</w:t>
             </w:r>
           </w:p>
         </w:tc>
@@ -6867,61 +6891,61 @@
                 <w:rFonts w:ascii="Times New Roman" w:hAnsi="Times New Roman"/>
                 <w:sz w:val="16"/>
               </w:rPr>
-              <w:t xml:space="preserve">4.48</w:t>
-            </w:r>
-          </w:p>
-        </w:tc>
-        <w:tc>
-          <w:tcPr>
-            <w:vAlign w:val="center"/>
-          </w:tcPr>
-          <w:p>
-            <w:pPr>
-              <w:pStyle w:val="Compact"/>
-              <w:spacing w:line="240" w:lineRule="auto" w:after="0"/>
-            </w:pPr>
-            <w:r>
-              <w:rPr>
-                <w:rFonts w:ascii="Times New Roman" w:hAnsi="Times New Roman"/>
-                <w:sz w:val="16"/>
-              </w:rPr>
-              <w:t xml:space="preserve">0.0334</w:t>
-            </w:r>
-          </w:p>
-        </w:tc>
-        <w:tc>
-          <w:tcPr>
-            <w:vAlign w:val="center"/>
-          </w:tcPr>
-          <w:p>
-            <w:pPr>
-              <w:pStyle w:val="Compact"/>
-              <w:spacing w:line="240" w:lineRule="auto" w:after="0"/>
-            </w:pPr>
-            <w:r>
-              <w:rPr>
-                <w:rFonts w:ascii="Times New Roman" w:hAnsi="Times New Roman"/>
-                <w:sz w:val="16"/>
-              </w:rPr>
-              <w:t xml:space="preserve">0.080</w:t>
-            </w:r>
-          </w:p>
-        </w:tc>
-        <w:tc>
-          <w:tcPr>
-            <w:vAlign w:val="center"/>
-          </w:tcPr>
-          <w:p>
-            <w:pPr>
-              <w:pStyle w:val="Compact"/>
-              <w:spacing w:line="240" w:lineRule="auto" w:after="0"/>
-            </w:pPr>
-            <w:r>
-              <w:rPr>
-                <w:rFonts w:ascii="Times New Roman" w:hAnsi="Times New Roman"/>
-                <w:sz w:val="16"/>
-              </w:rPr>
-              <w:t xml:space="preserve">0.403</w:t>
+              <w:t xml:space="preserve">2.60</w:t>
+            </w:r>
+          </w:p>
+        </w:tc>
+        <w:tc>
+          <w:tcPr>
+            <w:vAlign w:val="center"/>
+          </w:tcPr>
+          <w:p>
+            <w:pPr>
+              <w:pStyle w:val="Compact"/>
+              <w:spacing w:line="240" w:lineRule="auto" w:after="0"/>
+            </w:pPr>
+            <w:r>
+              <w:rPr>
+                <w:rFonts w:ascii="Times New Roman" w:hAnsi="Times New Roman"/>
+                <w:sz w:val="16"/>
+              </w:rPr>
+              <w:t xml:space="preserve">0.0338</w:t>
+            </w:r>
+          </w:p>
+        </w:tc>
+        <w:tc>
+          <w:tcPr>
+            <w:vAlign w:val="center"/>
+          </w:tcPr>
+          <w:p>
+            <w:pPr>
+              <w:pStyle w:val="Compact"/>
+              <w:spacing w:line="240" w:lineRule="auto" w:after="0"/>
+            </w:pPr>
+            <w:r>
+              <w:rPr>
+                <w:rFonts w:ascii="Times New Roman" w:hAnsi="Times New Roman"/>
+                <w:sz w:val="16"/>
+              </w:rPr>
+              <w:t xml:space="preserve">0.085</w:t>
+            </w:r>
+          </w:p>
+        </w:tc>
+        <w:tc>
+          <w:tcPr>
+            <w:vAlign w:val="center"/>
+          </w:tcPr>
+          <w:p>
+            <w:pPr>
+              <w:pStyle w:val="Compact"/>
+              <w:spacing w:line="240" w:lineRule="auto" w:after="0"/>
+            </w:pPr>
+            <w:r>
+              <w:rPr>
+                <w:rFonts w:ascii="Times New Roman" w:hAnsi="Times New Roman"/>
+                <w:sz w:val="16"/>
+              </w:rPr>
+              <w:t xml:space="preserve">0.405</w:t>
             </w:r>
           </w:p>
         </w:tc>
@@ -6957,25 +6981,25 @@
                 <w:rFonts w:ascii="Times New Roman" w:hAnsi="Times New Roman"/>
                 <w:sz w:val="16"/>
               </w:rPr>
-              <w:t xml:space="preserve">0.865</w:t>
-            </w:r>
-          </w:p>
-        </w:tc>
-        <w:tc>
-          <w:tcPr>
-            <w:vAlign w:val="center"/>
-          </w:tcPr>
-          <w:p>
-            <w:pPr>
-              <w:pStyle w:val="Compact"/>
-              <w:spacing w:line="240" w:lineRule="auto" w:after="0"/>
-            </w:pPr>
-            <w:r>
-              <w:rPr>
-                <w:rFonts w:ascii="Times New Roman" w:hAnsi="Times New Roman"/>
-                <w:sz w:val="16"/>
-              </w:rPr>
-              <w:t xml:space="preserve">0.351</w:t>
+              <w:t xml:space="preserve">0.864</w:t>
+            </w:r>
+          </w:p>
+        </w:tc>
+        <w:tc>
+          <w:tcPr>
+            <w:vAlign w:val="center"/>
+          </w:tcPr>
+          <w:p>
+            <w:pPr>
+              <w:pStyle w:val="Compact"/>
+              <w:spacing w:line="240" w:lineRule="auto" w:after="0"/>
+            </w:pPr>
+            <w:r>
+              <w:rPr>
+                <w:rFonts w:ascii="Times New Roman" w:hAnsi="Times New Roman"/>
+                <w:sz w:val="16"/>
+              </w:rPr>
+              <w:t xml:space="preserve">0.349</w:t>
             </w:r>
           </w:p>
         </w:tc>
@@ -7031,43 +7055,43 @@
                 <w:rFonts w:ascii="Times New Roman" w:hAnsi="Times New Roman"/>
                 <w:sz w:val="16"/>
               </w:rPr>
-              <w:t xml:space="preserve">0.0339</w:t>
-            </w:r>
-          </w:p>
-        </w:tc>
-        <w:tc>
-          <w:tcPr>
-            <w:vAlign w:val="center"/>
-          </w:tcPr>
-          <w:p>
-            <w:pPr>
-              <w:pStyle w:val="Compact"/>
-              <w:spacing w:line="240" w:lineRule="auto" w:after="0"/>
-            </w:pPr>
-            <w:r>
-              <w:rPr>
-                <w:rFonts w:ascii="Times New Roman" w:hAnsi="Times New Roman"/>
-                <w:sz w:val="16"/>
-              </w:rPr>
-              <w:t xml:space="preserve">0.082</w:t>
-            </w:r>
-          </w:p>
-        </w:tc>
-        <w:tc>
-          <w:tcPr>
-            <w:vAlign w:val="center"/>
-          </w:tcPr>
-          <w:p>
-            <w:pPr>
-              <w:pStyle w:val="Compact"/>
-              <w:spacing w:line="240" w:lineRule="auto" w:after="0"/>
-            </w:pPr>
-            <w:r>
-              <w:rPr>
-                <w:rFonts w:ascii="Times New Roman" w:hAnsi="Times New Roman"/>
-                <w:sz w:val="16"/>
-              </w:rPr>
-              <w:t xml:space="preserve">0.395</w:t>
+              <w:t xml:space="preserve">0.0341</w:t>
+            </w:r>
+          </w:p>
+        </w:tc>
+        <w:tc>
+          <w:tcPr>
+            <w:vAlign w:val="center"/>
+          </w:tcPr>
+          <w:p>
+            <w:pPr>
+              <w:pStyle w:val="Compact"/>
+              <w:spacing w:line="240" w:lineRule="auto" w:after="0"/>
+            </w:pPr>
+            <w:r>
+              <w:rPr>
+                <w:rFonts w:ascii="Times New Roman" w:hAnsi="Times New Roman"/>
+                <w:sz w:val="16"/>
+              </w:rPr>
+              <w:t xml:space="preserve">0.088</w:t>
+            </w:r>
+          </w:p>
+        </w:tc>
+        <w:tc>
+          <w:tcPr>
+            <w:vAlign w:val="center"/>
+          </w:tcPr>
+          <w:p>
+            <w:pPr>
+              <w:pStyle w:val="Compact"/>
+              <w:spacing w:line="240" w:lineRule="auto" w:after="0"/>
+            </w:pPr>
+            <w:r>
+              <w:rPr>
+                <w:rFonts w:ascii="Times New Roman" w:hAnsi="Times New Roman"/>
+                <w:sz w:val="16"/>
+              </w:rPr>
+              <w:t xml:space="preserve">0.400</w:t>
             </w:r>
           </w:p>
         </w:tc>
@@ -7103,25 +7127,25 @@
                 <w:rFonts w:ascii="Times New Roman" w:hAnsi="Times New Roman"/>
                 <w:sz w:val="16"/>
               </w:rPr>
-              <w:t xml:space="preserve">0.852</w:t>
-            </w:r>
-          </w:p>
-        </w:tc>
-        <w:tc>
-          <w:tcPr>
-            <w:vAlign w:val="center"/>
-          </w:tcPr>
-          <w:p>
-            <w:pPr>
-              <w:pStyle w:val="Compact"/>
-              <w:spacing w:line="240" w:lineRule="auto" w:after="0"/>
-            </w:pPr>
-            <w:r>
-              <w:rPr>
-                <w:rFonts w:ascii="Times New Roman" w:hAnsi="Times New Roman"/>
-                <w:sz w:val="16"/>
-              </w:rPr>
-              <w:t xml:space="preserve">0.341</w:t>
+              <w:t xml:space="preserve">0.851</w:t>
+            </w:r>
+          </w:p>
+        </w:tc>
+        <w:tc>
+          <w:tcPr>
+            <w:vAlign w:val="center"/>
+          </w:tcPr>
+          <w:p>
+            <w:pPr>
+              <w:pStyle w:val="Compact"/>
+              <w:spacing w:line="240" w:lineRule="auto" w:after="0"/>
+            </w:pPr>
+            <w:r>
+              <w:rPr>
+                <w:rFonts w:ascii="Times New Roman" w:hAnsi="Times New Roman"/>
+                <w:sz w:val="16"/>
+              </w:rPr>
+              <w:t xml:space="preserve">0.342</w:t>
             </w:r>
           </w:p>
         </w:tc>
@@ -7175,7 +7199,7 @@
         <w:t xml:space="preserve"> </w:t>
       </w:r>
       <w:r>
-        <w:t xml:space="preserve">= 175,901 species × province × year cells, 649 events). The dashed line marks unity. Note that unity is not the appropriate null for the warming terms: design-preserving permutation nulls that retain the provincial-annual climate and event structure are centred on 1.16 for accumulated warming and 0.96 for the interaction (Supplementary Fig. S11a), so the increment attributable to species-specific referencing is smaller than the distance from unity suggests.</w:t>
+        <w:t xml:space="preserve">= 175,640 species × province × year cells, 649 events). The dashed line marks unity. Note that unity is not the appropriate null for the warming terms: design-preserving permutation nulls that retain the provincial-annual climate and event structure are centred on 1.16 for accumulated warming and 0.95–0.96 for the interaction (Supplementary Fig. S11a), so the increment attributable to species-specific referencing is smaller than the distance from unity suggests.</w:t>
       </w:r>
       <w:r>
         <w:t xml:space="preserve"> </w:t>
@@ -7589,7 +7613,7 @@
         <w:t xml:space="preserve"> </w:t>
       </w:r>
       <w:r>
-        <w:t xml:space="preserve">= 7.7 × 10⁻⁴). Map lines delineate study areas and do not necessarily depict accepted national boundaries. Base map: standard map GS(2019)1822.</w:t>
+        <w:t xml:space="preserve">= 2.1 × 10⁻³). Map lines delineate study areas and do not necessarily depict accepted national boundaries. Base map: standard map GS(2019)1822.</w:t>
       </w:r>
     </w:p>
     <w:p>
@@ -7675,7 +7699,7 @@
         <w:t xml:space="preserve"> </w:t>
       </w:r>
       <w:r>
-        <w:t xml:space="preserve">= 0.039); against the geometry + effort null the departure points north (χ² = 25.8,</w:t>
+        <w:t xml:space="preserve">= 0.039); against the geometry + effort null the departure points north (χ² = 26.8,</w:t>
       </w:r>
       <w:r>
         <w:t xml:space="preserve"> </w:t>
@@ -7729,7 +7753,7 @@
         <w:t xml:space="preserve">a</w:t>
       </w:r>
       <w:r>
-        <w:t xml:space="preserve">, Province-year mean predicted hazard, 2002–2024, from the mechanistic and gradient-boosted models (Spearman ρ = 0.54).</w:t>
+        <w:t xml:space="preserve">, Province-year mean predicted hazard, 2002–2024, from the mechanistic and gradient-boosted models (Spearman ρ = 0.56).</w:t>
       </w:r>
       <w:r>
         <w:t xml:space="preserve"> </w:t>

</xml_diff>